<commit_message>
Redesign CV with premium two-column layout and photo
- Dark navy sidebar: cropped headshot, name, contacts, skill bars with
  visual fill indicators, expertise badges, languages, interests
- Right column: name banner strip, professional summary, 4 work
  experiences with bullet points, education, 6 projects in 2-col grid
- Photo auto-cropped to head+shoulders from about.jpg using Pillow

Co-Authored-By: Claude <noreply@anthropic.com>
</commit_message>
<xml_diff>
--- a/CV_Abiola_Adegbola_2025.docx
+++ b/CV_Abiola_Adegbola_2025.docx
@@ -9,13 +9,13 @@
         <w:tblLook w:firstColumn="1" w:firstRow="1" w:lastColumn="0" w:lastRow="0" w:noHBand="0" w:noVBand="1" w:val="04A0"/>
       </w:tblPr>
       <w:tblGrid>
-        <w:gridCol w:w="4933"/>
-        <w:gridCol w:w="4933"/>
+        <w:gridCol w:w="4513"/>
+        <w:gridCol w:w="4513"/>
       </w:tblGrid>
       <w:tr>
         <w:tc>
           <w:tcPr>
-            <w:tcW w:type="dxa" w:w="5669"/>
+            <w:tcW w:type="dxa" w:w="3855"/>
             <w:tcBdr>
               <w:top w:val="none" w:sz="0" w:space="0" w:color="auto"/>
               <w:left w:val="none" w:sz="0" w:space="0" w:color="auto"/>
@@ -24,61 +24,803 @@
               <w:insideH w:val="none" w:sz="0" w:space="0" w:color="auto"/>
               <w:insideV w:val="none" w:sz="0" w:space="0" w:color="auto"/>
             </w:tcBdr>
-            <w:shd w:val="clear" w:color="auto" w:fill="163753"/>
+            <w:shd w:val="clear" w:color="auto" w:fill="0F2A3F"/>
             <w:tcMar>
               <w:top w:w="200" w:type="dxa"/>
-              <w:start w:w="250" w:type="dxa"/>
+              <w:start w:w="220" w:type="dxa"/>
               <w:bottom w:w="200" w:type="dxa"/>
-              <w:end w:w="150" w:type="dxa"/>
+              <w:end w:w="220" w:type="dxa"/>
             </w:tcMar>
+            <w:vAlign w:val="top"/>
           </w:tcPr>
           <w:p>
             <w:pPr>
               <w:spacing w:before="0" w:after="80"/>
-              <w:jc w:val="left"/>
+              <w:jc w:val="center"/>
+            </w:pPr>
+            <w:r>
+              <w:drawing>
+                <wp:inline xmlns:a="http://schemas.openxmlformats.org/drawingml/2006/main" xmlns:pic="http://schemas.openxmlformats.org/drawingml/2006/picture">
+                  <wp:extent cx="1728000" cy="1728000"/>
+                  <wp:docPr id="1" name="Picture 1"/>
+                  <wp:cNvGraphicFramePr>
+                    <a:graphicFrameLocks noChangeAspect="1"/>
+                  </wp:cNvGraphicFramePr>
+                  <a:graphic>
+                    <a:graphicData uri="http://schemas.openxmlformats.org/drawingml/2006/picture">
+                      <pic:pic>
+                        <pic:nvPicPr>
+                          <pic:cNvPr id="0" name="image.jpg"/>
+                          <pic:cNvPicPr/>
+                        </pic:nvPicPr>
+                        <pic:blipFill>
+                          <a:blip r:embed="rId9"/>
+                          <a:stretch>
+                            <a:fillRect/>
+                          </a:stretch>
+                        </pic:blipFill>
+                        <pic:spPr>
+                          <a:xfrm>
+                            <a:off x="0" y="0"/>
+                            <a:ext cx="1728000" cy="1728000"/>
+                          </a:xfrm>
+                          <a:prstGeom prst="rect"/>
+                        </pic:spPr>
+                      </pic:pic>
+                    </a:graphicData>
+                  </a:graphic>
+                </wp:inline>
+              </w:drawing>
+            </w:r>
+          </w:p>
+          <w:p>
+            <w:pPr>
+              <w:spacing w:before="120" w:after="20"/>
+              <w:jc w:val="center"/>
             </w:pPr>
             <w:r>
               <w:rPr>
                 <w:rFonts w:ascii="Calibri" w:hAnsi="Calibri"/>
                 <w:b/>
                 <w:color w:val="FFFFFF"/>
-                <w:sz w:val="40"/>
+                <w:sz w:val="28"/>
               </w:rPr>
-              <w:t>ADEGBOLA Abiola Mansourou</w:t>
+              <w:t>ADEGBOLA</w:t>
             </w:r>
           </w:p>
           <w:p>
             <w:pPr>
               <w:spacing w:before="0" w:after="40"/>
-              <w:jc w:val="left"/>
+              <w:jc w:val="center"/>
             </w:pPr>
             <w:r>
               <w:rPr>
                 <w:rFonts w:ascii="Calibri" w:hAnsi="Calibri"/>
-                <w:color w:val="A8D0F5"/>
+                <w:color w:val="3DB8FF"/>
                 <w:sz w:val="22"/>
               </w:rPr>
-              <w:t>Ingénieur IT · DSI · Manager Projets</w:t>
+              <w:t>Abiola Mansourou</w:t>
             </w:r>
           </w:p>
           <w:p>
             <w:pPr>
-              <w:spacing w:before="40" w:after="0"/>
+              <w:spacing w:before="0" w:after="0"/>
+              <w:jc w:val="center"/>
             </w:pPr>
             <w:r>
               <w:rPr>
                 <w:rFonts w:ascii="Calibri" w:hAnsi="Calibri"/>
                 <w:i/>
+                <w:color w:val="AACCEE"/>
+                <w:sz w:val="17"/>
+              </w:rPr>
+              <w:t>Ingénieur IT · DSI · PMO</w:t>
+            </w:r>
+          </w:p>
+          <w:p>
+            <w:pPr>
+              <w:spacing w:before="240" w:after="60"/>
+              <w:pBdr>
+                <w:bottom w:val="single" w:sz="4" w:space="2" w:color="1A8CD8"/>
+              </w:pBdr>
+            </w:pPr>
+            <w:r>
+              <w:rPr>
+                <w:rFonts w:ascii="Calibri" w:hAnsi="Calibri"/>
+                <w:b/>
+                <w:caps/>
+                <w:color w:val="3DB8FF"/>
+                <w:sz w:val="17"/>
+              </w:rPr>
+              <w:t>CONTACT</w:t>
+            </w:r>
+          </w:p>
+          <w:p>
+            <w:pPr>
+              <w:spacing w:before="40" w:after="20"/>
+            </w:pPr>
+            <w:r>
+              <w:rPr>
+                <w:rFonts w:ascii="Calibri" w:hAnsi="Calibri"/>
                 <w:color w:val="CCDDEE"/>
-                <w:sz w:val="18"/>
+                <w:sz w:val="17"/>
               </w:rPr>
-              <w:t>Expert en transformation digitale et pilotage de projets SI</w:t>
+              <w:t>📍  Abidjan, Côte d'Ivoire</w:t>
+            </w:r>
+          </w:p>
+          <w:p>
+            <w:pPr>
+              <w:spacing w:before="40" w:after="20"/>
+            </w:pPr>
+            <w:r>
+              <w:rPr>
+                <w:rFonts w:ascii="Calibri" w:hAnsi="Calibri"/>
+                <w:color w:val="CCDDEE"/>
+                <w:sz w:val="17"/>
+              </w:rPr>
+              <w:t>📞  +225 01 41 87 05 79</w:t>
+            </w:r>
+          </w:p>
+          <w:p>
+            <w:pPr>
+              <w:spacing w:before="40" w:after="20"/>
+            </w:pPr>
+            <w:r>
+              <w:rPr>
+                <w:rFonts w:ascii="Calibri" w:hAnsi="Calibri"/>
+                <w:color w:val="CCDDEE"/>
+                <w:sz w:val="17"/>
+              </w:rPr>
+              <w:t>✉  abiole68@gmail.com</w:t>
+            </w:r>
+          </w:p>
+          <w:p>
+            <w:pPr>
+              <w:spacing w:before="40" w:after="20"/>
+            </w:pPr>
+            <w:r>
+              <w:rPr>
+                <w:rFonts w:ascii="Calibri" w:hAnsi="Calibri"/>
+                <w:color w:val="CCDDEE"/>
+                <w:sz w:val="17"/>
+              </w:rPr>
+              <w:t>🌐  dev-folio-abiola.vercel.app</w:t>
+            </w:r>
+          </w:p>
+          <w:p>
+            <w:pPr>
+              <w:spacing w:before="40" w:after="20"/>
+            </w:pPr>
+            <w:r>
+              <w:rPr>
+                <w:rFonts w:ascii="Calibri" w:hAnsi="Calibri"/>
+                <w:color w:val="CCDDEE"/>
+                <w:sz w:val="17"/>
+              </w:rPr>
+              <w:t>🔗  linkedin.com/in/adegbola-abiola</w:t>
+            </w:r>
+          </w:p>
+          <w:p>
+            <w:pPr>
+              <w:spacing w:before="40" w:after="20"/>
+            </w:pPr>
+            <w:r>
+              <w:rPr>
+                <w:rFonts w:ascii="Calibri" w:hAnsi="Calibri"/>
+                <w:color w:val="CCDDEE"/>
+                <w:sz w:val="17"/>
+              </w:rPr>
+              <w:t>💻  github.com/AbiolaAdegbola</w:t>
+            </w:r>
+          </w:p>
+          <w:p>
+            <w:pPr>
+              <w:spacing w:before="240" w:after="60"/>
+              <w:pBdr>
+                <w:bottom w:val="single" w:sz="4" w:space="2" w:color="1A8CD8"/>
+              </w:pBdr>
+            </w:pPr>
+            <w:r>
+              <w:rPr>
+                <w:rFonts w:ascii="Calibri" w:hAnsi="Calibri"/>
+                <w:b/>
+                <w:caps/>
+                <w:color w:val="3DB8FF"/>
+                <w:sz w:val="17"/>
+              </w:rPr>
+              <w:t>COMPÉTENCES</w:t>
+            </w:r>
+          </w:p>
+          <w:p>
+            <w:pPr>
+              <w:spacing w:before="40" w:after="40"/>
+            </w:pPr>
+            <w:r>
+              <w:rPr>
+                <w:rFonts w:ascii="Calibri" w:hAnsi="Calibri"/>
+                <w:color w:val="CCDDEE"/>
+                <w:sz w:val="17"/>
+              </w:rPr>
+              <w:t xml:space="preserve">React / Next.js   </w:t>
+            </w:r>
+            <w:r>
+              <w:rPr>
+                <w:rFonts w:ascii="Calibri" w:hAnsi="Calibri"/>
+                <w:color w:val="3DB8FF"/>
+                <w:sz w:val="14"/>
+              </w:rPr>
+              <w:t>██████████████████</w:t>
+            </w:r>
+            <w:r>
+              <w:rPr>
+                <w:rFonts w:ascii="Calibri" w:hAnsi="Calibri"/>
+                <w:color w:val="2A4A60"/>
+                <w:sz w:val="14"/>
+              </w:rPr>
+              <w:t>░░</w:t>
+            </w:r>
+          </w:p>
+          <w:p>
+            <w:pPr>
+              <w:spacing w:before="40" w:after="40"/>
+            </w:pPr>
+            <w:r>
+              <w:rPr>
+                <w:rFonts w:ascii="Calibri" w:hAnsi="Calibri"/>
+                <w:color w:val="CCDDEE"/>
+                <w:sz w:val="17"/>
+              </w:rPr>
+              <w:t xml:space="preserve">Node.js / Express </w:t>
+            </w:r>
+            <w:r>
+              <w:rPr>
+                <w:rFonts w:ascii="Calibri" w:hAnsi="Calibri"/>
+                <w:color w:val="3DB8FF"/>
+                <w:sz w:val="14"/>
+              </w:rPr>
+              <w:t>██████████████████</w:t>
+            </w:r>
+            <w:r>
+              <w:rPr>
+                <w:rFonts w:ascii="Calibri" w:hAnsi="Calibri"/>
+                <w:color w:val="2A4A60"/>
+                <w:sz w:val="14"/>
+              </w:rPr>
+              <w:t>░░</w:t>
+            </w:r>
+          </w:p>
+          <w:p>
+            <w:pPr>
+              <w:spacing w:before="40" w:after="40"/>
+            </w:pPr>
+            <w:r>
+              <w:rPr>
+                <w:rFonts w:ascii="Calibri" w:hAnsi="Calibri"/>
+                <w:color w:val="CCDDEE"/>
+                <w:sz w:val="17"/>
+              </w:rPr>
+              <w:t xml:space="preserve">Flutter / Dart    </w:t>
+            </w:r>
+            <w:r>
+              <w:rPr>
+                <w:rFonts w:ascii="Calibri" w:hAnsi="Calibri"/>
+                <w:color w:val="3DB8FF"/>
+                <w:sz w:val="14"/>
+              </w:rPr>
+              <w:t>█████████████████</w:t>
+            </w:r>
+            <w:r>
+              <w:rPr>
+                <w:rFonts w:ascii="Calibri" w:hAnsi="Calibri"/>
+                <w:color w:val="2A4A60"/>
+                <w:sz w:val="14"/>
+              </w:rPr>
+              <w:t>░░░</w:t>
+            </w:r>
+          </w:p>
+          <w:p>
+            <w:pPr>
+              <w:spacing w:before="40" w:after="40"/>
+            </w:pPr>
+            <w:r>
+              <w:rPr>
+                <w:rFonts w:ascii="Calibri" w:hAnsi="Calibri"/>
+                <w:color w:val="CCDDEE"/>
+                <w:sz w:val="17"/>
+              </w:rPr>
+              <w:t xml:space="preserve">Python            </w:t>
+            </w:r>
+            <w:r>
+              <w:rPr>
+                <w:rFonts w:ascii="Calibri" w:hAnsi="Calibri"/>
+                <w:color w:val="3DB8FF"/>
+                <w:sz w:val="14"/>
+              </w:rPr>
+              <w:t>████████████████</w:t>
+            </w:r>
+            <w:r>
+              <w:rPr>
+                <w:rFonts w:ascii="Calibri" w:hAnsi="Calibri"/>
+                <w:color w:val="2A4A60"/>
+                <w:sz w:val="14"/>
+              </w:rPr>
+              <w:t>░░░░</w:t>
+            </w:r>
+          </w:p>
+          <w:p>
+            <w:pPr>
+              <w:spacing w:before="40" w:after="40"/>
+            </w:pPr>
+            <w:r>
+              <w:rPr>
+                <w:rFonts w:ascii="Calibri" w:hAnsi="Calibri"/>
+                <w:color w:val="CCDDEE"/>
+                <w:sz w:val="17"/>
+              </w:rPr>
+              <w:t xml:space="preserve">PHP / Laravel     </w:t>
+            </w:r>
+            <w:r>
+              <w:rPr>
+                <w:rFonts w:ascii="Calibri" w:hAnsi="Calibri"/>
+                <w:color w:val="3DB8FF"/>
+                <w:sz w:val="14"/>
+              </w:rPr>
+              <w:t>████████████████</w:t>
+            </w:r>
+            <w:r>
+              <w:rPr>
+                <w:rFonts w:ascii="Calibri" w:hAnsi="Calibri"/>
+                <w:color w:val="2A4A60"/>
+                <w:sz w:val="14"/>
+              </w:rPr>
+              <w:t>░░░░</w:t>
+            </w:r>
+          </w:p>
+          <w:p>
+            <w:pPr>
+              <w:spacing w:before="40" w:after="40"/>
+            </w:pPr>
+            <w:r>
+              <w:rPr>
+                <w:rFonts w:ascii="Calibri" w:hAnsi="Calibri"/>
+                <w:color w:val="CCDDEE"/>
+                <w:sz w:val="17"/>
+              </w:rPr>
+              <w:t xml:space="preserve">MySQL / MongoDB   </w:t>
+            </w:r>
+            <w:r>
+              <w:rPr>
+                <w:rFonts w:ascii="Calibri" w:hAnsi="Calibri"/>
+                <w:color w:val="3DB8FF"/>
+                <w:sz w:val="14"/>
+              </w:rPr>
+              <w:t>██████████████████</w:t>
+            </w:r>
+            <w:r>
+              <w:rPr>
+                <w:rFonts w:ascii="Calibri" w:hAnsi="Calibri"/>
+                <w:color w:val="2A4A60"/>
+                <w:sz w:val="14"/>
+              </w:rPr>
+              <w:t>░░</w:t>
+            </w:r>
+          </w:p>
+          <w:p>
+            <w:pPr>
+              <w:spacing w:before="40" w:after="40"/>
+            </w:pPr>
+            <w:r>
+              <w:rPr>
+                <w:rFonts w:ascii="Calibri" w:hAnsi="Calibri"/>
+                <w:color w:val="CCDDEE"/>
+                <w:sz w:val="17"/>
+              </w:rPr>
+              <w:t xml:space="preserve">GCP / Firebase    </w:t>
+            </w:r>
+            <w:r>
+              <w:rPr>
+                <w:rFonts w:ascii="Calibri" w:hAnsi="Calibri"/>
+                <w:color w:val="3DB8FF"/>
+                <w:sz w:val="14"/>
+              </w:rPr>
+              <w:t>█████████████████</w:t>
+            </w:r>
+            <w:r>
+              <w:rPr>
+                <w:rFonts w:ascii="Calibri" w:hAnsi="Calibri"/>
+                <w:color w:val="2A4A60"/>
+                <w:sz w:val="14"/>
+              </w:rPr>
+              <w:t>░░░</w:t>
+            </w:r>
+          </w:p>
+          <w:p>
+            <w:pPr>
+              <w:spacing w:before="40" w:after="40"/>
+            </w:pPr>
+            <w:r>
+              <w:rPr>
+                <w:rFonts w:ascii="Calibri" w:hAnsi="Calibri"/>
+                <w:color w:val="CCDDEE"/>
+                <w:sz w:val="17"/>
+              </w:rPr>
+              <w:t xml:space="preserve">AWS / Azure       </w:t>
+            </w:r>
+            <w:r>
+              <w:rPr>
+                <w:rFonts w:ascii="Calibri" w:hAnsi="Calibri"/>
+                <w:color w:val="3DB8FF"/>
+                <w:sz w:val="14"/>
+              </w:rPr>
+              <w:t>██████████████</w:t>
+            </w:r>
+            <w:r>
+              <w:rPr>
+                <w:rFonts w:ascii="Calibri" w:hAnsi="Calibri"/>
+                <w:color w:val="2A4A60"/>
+                <w:sz w:val="14"/>
+              </w:rPr>
+              <w:t>░░░░░░</w:t>
+            </w:r>
+          </w:p>
+          <w:p>
+            <w:pPr>
+              <w:spacing w:before="40" w:after="40"/>
+            </w:pPr>
+            <w:r>
+              <w:rPr>
+                <w:rFonts w:ascii="Calibri" w:hAnsi="Calibri"/>
+                <w:color w:val="CCDDEE"/>
+                <w:sz w:val="17"/>
+              </w:rPr>
+              <w:t xml:space="preserve">Docker / CI-CD    </w:t>
+            </w:r>
+            <w:r>
+              <w:rPr>
+                <w:rFonts w:ascii="Calibri" w:hAnsi="Calibri"/>
+                <w:color w:val="3DB8FF"/>
+                <w:sz w:val="14"/>
+              </w:rPr>
+              <w:t>██████████████</w:t>
+            </w:r>
+            <w:r>
+              <w:rPr>
+                <w:rFonts w:ascii="Calibri" w:hAnsi="Calibri"/>
+                <w:color w:val="2A4A60"/>
+                <w:sz w:val="14"/>
+              </w:rPr>
+              <w:t>░░░░░░</w:t>
+            </w:r>
+          </w:p>
+          <w:p>
+            <w:pPr>
+              <w:spacing w:before="40" w:after="40"/>
+            </w:pPr>
+            <w:r>
+              <w:rPr>
+                <w:rFonts w:ascii="Calibri" w:hAnsi="Calibri"/>
+                <w:color w:val="CCDDEE"/>
+                <w:sz w:val="17"/>
+              </w:rPr>
+              <w:t xml:space="preserve">Arduino / IoT     </w:t>
+            </w:r>
+            <w:r>
+              <w:rPr>
+                <w:rFonts w:ascii="Calibri" w:hAnsi="Calibri"/>
+                <w:color w:val="3DB8FF"/>
+                <w:sz w:val="14"/>
+              </w:rPr>
+              <w:t>███████████████</w:t>
+            </w:r>
+            <w:r>
+              <w:rPr>
+                <w:rFonts w:ascii="Calibri" w:hAnsi="Calibri"/>
+                <w:color w:val="2A4A60"/>
+                <w:sz w:val="14"/>
+              </w:rPr>
+              <w:t>░░░░░</w:t>
+            </w:r>
+          </w:p>
+          <w:p>
+            <w:pPr>
+              <w:spacing w:before="240" w:after="60"/>
+              <w:pBdr>
+                <w:bottom w:val="single" w:sz="4" w:space="2" w:color="1A8CD8"/>
+              </w:pBdr>
+            </w:pPr>
+            <w:r>
+              <w:rPr>
+                <w:rFonts w:ascii="Calibri" w:hAnsi="Calibri"/>
+                <w:b/>
+                <w:caps/>
+                <w:color w:val="3DB8FF"/>
+                <w:sz w:val="17"/>
+              </w:rPr>
+              <w:t>EXPERTISE</w:t>
+            </w:r>
+          </w:p>
+          <w:p>
+            <w:pPr>
+              <w:spacing w:before="20" w:after="20"/>
+            </w:pPr>
+            <w:r>
+              <w:rPr>
+                <w:rFonts w:ascii="Calibri" w:hAnsi="Calibri"/>
+                <w:color w:val="CCDDEE"/>
+                <w:sz w:val="17"/>
+              </w:rPr>
+              <w:t>✔  Manager Projets IT</w:t>
+            </w:r>
+          </w:p>
+          <w:p>
+            <w:pPr>
+              <w:spacing w:before="20" w:after="20"/>
+            </w:pPr>
+            <w:r>
+              <w:rPr>
+                <w:rFonts w:ascii="Calibri" w:hAnsi="Calibri"/>
+                <w:color w:val="CCDDEE"/>
+                <w:sz w:val="17"/>
+              </w:rPr>
+              <w:t>✔  DSI / PMO</w:t>
+            </w:r>
+          </w:p>
+          <w:p>
+            <w:pPr>
+              <w:spacing w:before="20" w:after="20"/>
+            </w:pPr>
+            <w:r>
+              <w:rPr>
+                <w:rFonts w:ascii="Calibri" w:hAnsi="Calibri"/>
+                <w:color w:val="CCDDEE"/>
+                <w:sz w:val="17"/>
+              </w:rPr>
+              <w:t>✔  Transformation Digitale</w:t>
+            </w:r>
+          </w:p>
+          <w:p>
+            <w:pPr>
+              <w:spacing w:before="20" w:after="20"/>
+            </w:pPr>
+            <w:r>
+              <w:rPr>
+                <w:rFonts w:ascii="Calibri" w:hAnsi="Calibri"/>
+                <w:color w:val="CCDDEE"/>
+                <w:sz w:val="17"/>
+              </w:rPr>
+              <w:t>✔  ERP &amp; Applications Métier</w:t>
+            </w:r>
+          </w:p>
+          <w:p>
+            <w:pPr>
+              <w:spacing w:before="20" w:after="20"/>
+            </w:pPr>
+            <w:r>
+              <w:rPr>
+                <w:rFonts w:ascii="Calibri" w:hAnsi="Calibri"/>
+                <w:color w:val="CCDDEE"/>
+                <w:sz w:val="17"/>
+              </w:rPr>
+              <w:t>✔  Infrastructure &amp; Support IT</w:t>
+            </w:r>
+          </w:p>
+          <w:p>
+            <w:pPr>
+              <w:spacing w:before="20" w:after="20"/>
+            </w:pPr>
+            <w:r>
+              <w:rPr>
+                <w:rFonts w:ascii="Calibri" w:hAnsi="Calibri"/>
+                <w:color w:val="CCDDEE"/>
+                <w:sz w:val="17"/>
+              </w:rPr>
+              <w:t>✔  Dev Senior Full Stack</w:t>
+            </w:r>
+          </w:p>
+          <w:p>
+            <w:pPr>
+              <w:spacing w:before="20" w:after="20"/>
+            </w:pPr>
+            <w:r>
+              <w:rPr>
+                <w:rFonts w:ascii="Calibri" w:hAnsi="Calibri"/>
+                <w:color w:val="CCDDEE"/>
+                <w:sz w:val="17"/>
+              </w:rPr>
+              <w:t>✔  MS Project · Azure · M365</w:t>
+            </w:r>
+          </w:p>
+          <w:p>
+            <w:pPr>
+              <w:spacing w:before="20" w:after="20"/>
+            </w:pPr>
+            <w:r>
+              <w:rPr>
+                <w:rFonts w:ascii="Calibri" w:hAnsi="Calibri"/>
+                <w:color w:val="CCDDEE"/>
+                <w:sz w:val="17"/>
+              </w:rPr>
+              <w:t>✔  Maintenance &amp; Helpdesk N2/N3</w:t>
+            </w:r>
+          </w:p>
+          <w:p>
+            <w:pPr>
+              <w:spacing w:before="240" w:after="60"/>
+              <w:pBdr>
+                <w:bottom w:val="single" w:sz="4" w:space="2" w:color="1A8CD8"/>
+              </w:pBdr>
+            </w:pPr>
+            <w:r>
+              <w:rPr>
+                <w:rFonts w:ascii="Calibri" w:hAnsi="Calibri"/>
+                <w:b/>
+                <w:caps/>
+                <w:color w:val="3DB8FF"/>
+                <w:sz w:val="17"/>
+              </w:rPr>
+              <w:t>LANGUES</w:t>
+            </w:r>
+          </w:p>
+          <w:p>
+            <w:pPr>
+              <w:spacing w:before="40" w:after="40"/>
+            </w:pPr>
+            <w:r>
+              <w:rPr>
+                <w:rFonts w:ascii="Calibri" w:hAnsi="Calibri"/>
+                <w:color w:val="CCDDEE"/>
+                <w:sz w:val="17"/>
+              </w:rPr>
+              <w:t xml:space="preserve">Français          </w:t>
+            </w:r>
+            <w:r>
+              <w:rPr>
+                <w:rFonts w:ascii="Calibri" w:hAnsi="Calibri"/>
+                <w:color w:val="3DB8FF"/>
+                <w:sz w:val="14"/>
+              </w:rPr>
+              <w:t>████████████████████</w:t>
+            </w:r>
+            <w:r>
+              <w:rPr>
+                <w:rFonts w:ascii="Calibri" w:hAnsi="Calibri"/>
+                <w:color w:val="2A4A60"/>
+                <w:sz w:val="14"/>
+              </w:rPr>
+            </w:r>
+          </w:p>
+          <w:p>
+            <w:pPr>
+              <w:spacing w:before="40" w:after="40"/>
+            </w:pPr>
+            <w:r>
+              <w:rPr>
+                <w:rFonts w:ascii="Calibri" w:hAnsi="Calibri"/>
+                <w:color w:val="CCDDEE"/>
+                <w:sz w:val="17"/>
+              </w:rPr>
+              <w:t xml:space="preserve">Anglais (B2)      </w:t>
+            </w:r>
+            <w:r>
+              <w:rPr>
+                <w:rFonts w:ascii="Calibri" w:hAnsi="Calibri"/>
+                <w:color w:val="3DB8FF"/>
+                <w:sz w:val="14"/>
+              </w:rPr>
+              <w:t>██████████████</w:t>
+            </w:r>
+            <w:r>
+              <w:rPr>
+                <w:rFonts w:ascii="Calibri" w:hAnsi="Calibri"/>
+                <w:color w:val="2A4A60"/>
+                <w:sz w:val="14"/>
+              </w:rPr>
+              <w:t>░░░░░░</w:t>
+            </w:r>
+          </w:p>
+          <w:p>
+            <w:pPr>
+              <w:spacing w:before="40" w:after="40"/>
+            </w:pPr>
+            <w:r>
+              <w:rPr>
+                <w:rFonts w:ascii="Calibri" w:hAnsi="Calibri"/>
+                <w:color w:val="CCDDEE"/>
+                <w:sz w:val="17"/>
+              </w:rPr>
+              <w:t xml:space="preserve">Dioula            </w:t>
+            </w:r>
+            <w:r>
+              <w:rPr>
+                <w:rFonts w:ascii="Calibri" w:hAnsi="Calibri"/>
+                <w:color w:val="3DB8FF"/>
+                <w:sz w:val="14"/>
+              </w:rPr>
+              <w:t>█████████████████</w:t>
+            </w:r>
+            <w:r>
+              <w:rPr>
+                <w:rFonts w:ascii="Calibri" w:hAnsi="Calibri"/>
+                <w:color w:val="2A4A60"/>
+                <w:sz w:val="14"/>
+              </w:rPr>
+              <w:t>░░░</w:t>
+            </w:r>
+          </w:p>
+          <w:p>
+            <w:pPr>
+              <w:spacing w:before="240" w:after="60"/>
+              <w:pBdr>
+                <w:bottom w:val="single" w:sz="4" w:space="2" w:color="1A8CD8"/>
+              </w:pBdr>
+            </w:pPr>
+            <w:r>
+              <w:rPr>
+                <w:rFonts w:ascii="Calibri" w:hAnsi="Calibri"/>
+                <w:b/>
+                <w:caps/>
+                <w:color w:val="3DB8FF"/>
+                <w:sz w:val="17"/>
+              </w:rPr>
+              <w:t>INTÉRÊTS</w:t>
+            </w:r>
+          </w:p>
+          <w:p>
+            <w:pPr>
+              <w:spacing w:before="40" w:after="20"/>
+            </w:pPr>
+            <w:r>
+              <w:rPr>
+                <w:rFonts w:ascii="Calibri" w:hAnsi="Calibri"/>
+                <w:color w:val="CCDDEE"/>
+                <w:sz w:val="17"/>
+              </w:rPr>
+              <w:t>🤖 Intelligence Artificielle</w:t>
+            </w:r>
+          </w:p>
+          <w:p>
+            <w:pPr>
+              <w:spacing w:before="40" w:after="20"/>
+            </w:pPr>
+            <w:r>
+              <w:rPr>
+                <w:rFonts w:ascii="Calibri" w:hAnsi="Calibri"/>
+                <w:color w:val="CCDDEE"/>
+                <w:sz w:val="17"/>
+              </w:rPr>
+              <w:t>📡 IoT &amp; Robotique</w:t>
+            </w:r>
+          </w:p>
+          <w:p>
+            <w:pPr>
+              <w:spacing w:before="40" w:after="20"/>
+            </w:pPr>
+            <w:r>
+              <w:rPr>
+                <w:rFonts w:ascii="Calibri" w:hAnsi="Calibri"/>
+                <w:color w:val="CCDDEE"/>
+                <w:sz w:val="17"/>
+              </w:rPr>
+              <w:t>🚀 Entrepreneuriat Tech</w:t>
+            </w:r>
+          </w:p>
+          <w:p>
+            <w:pPr>
+              <w:spacing w:before="40" w:after="20"/>
+            </w:pPr>
+            <w:r>
+              <w:rPr>
+                <w:rFonts w:ascii="Calibri" w:hAnsi="Calibri"/>
+                <w:color w:val="CCDDEE"/>
+                <w:sz w:val="17"/>
+              </w:rPr>
+              <w:t>🔓 Open Source</w:t>
             </w:r>
           </w:p>
         </w:tc>
         <w:tc>
           <w:tcPr>
-            <w:tcW w:type="dxa" w:w="3969"/>
+            <w:tcW w:type="dxa" w:w="8050"/>
             <w:tcBdr>
               <w:top w:val="none" w:sz="0" w:space="0" w:color="auto"/>
               <w:left w:val="none" w:sz="0" w:space="0" w:color="auto"/>
@@ -87,239 +829,191 @@
               <w:insideH w:val="none" w:sz="0" w:space="0" w:color="auto"/>
               <w:insideV w:val="none" w:sz="0" w:space="0" w:color="auto"/>
             </w:tcBdr>
-            <w:shd w:val="clear" w:color="auto" w:fill="163753"/>
+            <w:shd w:val="clear" w:color="auto" w:fill="FFFFFF"/>
             <w:tcMar>
               <w:top w:w="200" w:type="dxa"/>
-              <w:start w:w="150" w:type="dxa"/>
+              <w:start w:w="280" w:type="dxa"/>
               <w:bottom w:w="200" w:type="dxa"/>
-              <w:end w:w="250" w:type="dxa"/>
+              <w:end w:w="260" w:type="dxa"/>
             </w:tcMar>
+            <w:vAlign w:val="top"/>
           </w:tcPr>
           <w:p>
             <w:pPr>
-              <w:spacing w:before="20" w:after="20"/>
-              <w:jc w:val="right"/>
+              <w:spacing w:before="0" w:after="0"/>
+            </w:pPr>
+          </w:p>
+          <w:tbl>
+            <w:tblPr>
+              <w:tblW w:type="auto" w:w="0"/>
+              <w:tblLook w:firstColumn="1" w:firstRow="1" w:lastColumn="0" w:lastRow="0" w:noHBand="0" w:noVBand="1" w:val="04A0"/>
+            </w:tblPr>
+            <w:tblGrid>
+              <w:gridCol w:w="8050"/>
+            </w:tblGrid>
+            <w:tr>
+              <w:tc>
+                <w:tcPr>
+                  <w:tcW w:type="dxa" w:w="8050"/>
+                  <w:tcBdr>
+                    <w:top w:val="none" w:sz="0" w:space="0" w:color="auto"/>
+                    <w:left w:val="none" w:sz="0" w:space="0" w:color="auto"/>
+                    <w:bottom w:val="none" w:sz="0" w:space="0" w:color="auto"/>
+                    <w:right w:val="none" w:sz="0" w:space="0" w:color="auto"/>
+                    <w:insideH w:val="none" w:sz="0" w:space="0" w:color="auto"/>
+                    <w:insideV w:val="none" w:sz="0" w:space="0" w:color="auto"/>
+                  </w:tcBdr>
+                  <w:shd w:val="clear" w:color="auto" w:fill="0F2A3F"/>
+                  <w:tcMar>
+                    <w:top w:w="240" w:type="dxa"/>
+                    <w:start w:w="280" w:type="dxa"/>
+                    <w:bottom w:w="180" w:type="dxa"/>
+                    <w:end w:w="280" w:type="dxa"/>
+                  </w:tcMar>
+                </w:tcPr>
+                <w:p>
+                  <w:pPr>
+                    <w:spacing w:before="0" w:after="60"/>
+                  </w:pPr>
+                  <w:r>
+                    <w:rPr>
+                      <w:rFonts w:ascii="Calibri" w:hAnsi="Calibri"/>
+                      <w:b/>
+                      <w:color w:val="FFFFFF"/>
+                      <w:sz w:val="44"/>
+                    </w:rPr>
+                    <w:t>ADEGBOLA Abiola Mansourou</w:t>
+                  </w:r>
+                </w:p>
+                <w:p>
+                  <w:pPr>
+                    <w:spacing w:before="0" w:after="40"/>
+                  </w:pPr>
+                  <w:r>
+                    <w:rPr>
+                      <w:rFonts w:ascii="Calibri" w:hAnsi="Calibri"/>
+                      <w:i/>
+                      <w:color w:val="3DB8FF"/>
+                      <w:sz w:val="21"/>
+                    </w:rPr>
+                    <w:t>Ingénieur IT  ·  Directeur des Systèmes d'Information  ·  Manager Projets</w:t>
+                  </w:r>
+                </w:p>
+                <w:p>
+                  <w:pPr>
+                    <w:spacing w:before="40" w:after="0"/>
+                  </w:pPr>
+                  <w:r>
+                    <w:rPr>
+                      <w:rFonts w:ascii="Calibri" w:hAnsi="Calibri"/>
+                      <w:i/>
+                      <w:color w:val="99CCEE"/>
+                      <w:sz w:val="18"/>
+                    </w:rPr>
+                    <w:t>Expert en transformation digitale · Dev Full Stack · IoT</w:t>
+                  </w:r>
+                </w:p>
+              </w:tc>
+            </w:tr>
+          </w:tbl>
+          <w:p/>
+          <w:p>
+            <w:pPr>
+              <w:spacing w:before="240" w:after="60"/>
+              <w:pBdr>
+                <w:bottom w:val="single" w:sz="6" w:space="2" w:color="0F2A3F"/>
+              </w:pBdr>
+            </w:pPr>
+            <w:r>
+              <w:rPr>
+                <w:sz w:val="22"/>
+              </w:rPr>
+              <w:t xml:space="preserve">👤  </w:t>
+            </w:r>
+            <w:r>
+              <w:rPr>
+                <w:rFonts w:ascii="Calibri" w:hAnsi="Calibri"/>
+                <w:b/>
+                <w:caps/>
+                <w:color w:val="0F2A3F"/>
+                <w:sz w:val="21"/>
+              </w:rPr>
+              <w:t>PROFIL PROFESSIONNEL</w:t>
+            </w:r>
+          </w:p>
+          <w:p>
+            <w:pPr>
+              <w:spacing w:before="60" w:after="100"/>
             </w:pPr>
             <w:r>
               <w:rPr>
                 <w:rFonts w:ascii="Calibri" w:hAnsi="Calibri"/>
-                <w:b w:val="0"/>
-                <w:i w:val="0"/>
-                <w:color w:val="CCDDEE"/>
-                <w:sz w:val="18"/>
+                <w:color w:val="444455"/>
+                <w:sz w:val="19"/>
               </w:rPr>
-              <w:t>📍  Abidjan, Côte d'Ivoire</w:t>
+              <w:t>Ingénieur IT avec 3+ années d'expérience en développement full-stack, management de projets SI et pilotage d'infrastructures cloud. Spécialisé dans la transformation digitale des organisations, je conçois et déploie des solutions métier adaptées aux contraintes terrain : ERP, applications mobiles, IoT. Leadership démontré en contexte startup et corporate, avec une forte orientation résultats et innovation.</w:t>
             </w:r>
           </w:p>
           <w:p>
             <w:pPr>
-              <w:spacing w:before="20" w:after="20"/>
-              <w:jc w:val="right"/>
+              <w:spacing w:before="240" w:after="60"/>
+              <w:pBdr>
+                <w:bottom w:val="single" w:sz="6" w:space="2" w:color="0F2A3F"/>
+              </w:pBdr>
             </w:pPr>
             <w:r>
               <w:rPr>
+                <w:sz w:val="22"/>
+              </w:rPr>
+              <w:t xml:space="preserve">💼  </w:t>
+            </w:r>
+            <w:r>
+              <w:rPr>
                 <w:rFonts w:ascii="Calibri" w:hAnsi="Calibri"/>
-                <w:b w:val="0"/>
-                <w:i w:val="0"/>
-                <w:color w:val="CCDDEE"/>
-                <w:sz w:val="18"/>
+                <w:b/>
+                <w:caps/>
+                <w:color w:val="0F2A3F"/>
+                <w:sz w:val="21"/>
               </w:rPr>
-              <w:t>📞  +225 01 41 87 05 79</w:t>
+              <w:t>EXPÉRIENCES PROFESSIONNELLES</w:t>
             </w:r>
           </w:p>
           <w:p>
             <w:pPr>
-              <w:spacing w:before="20" w:after="20"/>
-              <w:jc w:val="right"/>
-            </w:pPr>
-            <w:r>
-              <w:rPr>
-                <w:rFonts w:ascii="Calibri" w:hAnsi="Calibri"/>
-                <w:b w:val="0"/>
-                <w:i w:val="0"/>
-                <w:color w:val="CCDDEE"/>
-                <w:sz w:val="18"/>
-              </w:rPr>
-              <w:t>✉  abiole68@gmail.com</w:t>
-            </w:r>
-          </w:p>
-          <w:p>
-            <w:pPr>
-              <w:spacing w:before="20" w:after="20"/>
-              <w:jc w:val="right"/>
-            </w:pPr>
-            <w:r>
-              <w:rPr>
-                <w:rFonts w:ascii="Calibri" w:hAnsi="Calibri"/>
-                <w:b w:val="0"/>
-                <w:i w:val="0"/>
-                <w:color w:val="CCDDEE"/>
-                <w:sz w:val="18"/>
-              </w:rPr>
-              <w:t>🌐  dev-folio-abiola.vercel.app</w:t>
-            </w:r>
-          </w:p>
-          <w:p>
-            <w:pPr>
-              <w:spacing w:before="20" w:after="20"/>
-              <w:jc w:val="right"/>
-            </w:pPr>
-            <w:r>
-              <w:rPr>
-                <w:rFonts w:ascii="Calibri" w:hAnsi="Calibri"/>
-                <w:b w:val="0"/>
-                <w:i w:val="0"/>
-                <w:color w:val="CCDDEE"/>
-                <w:sz w:val="18"/>
-              </w:rPr>
-              <w:t>🔗  linkedin.com/in/adegbola-abiola-7a5427222</w:t>
-            </w:r>
-          </w:p>
-          <w:p>
-            <w:pPr>
-              <w:spacing w:before="20" w:after="20"/>
-              <w:jc w:val="right"/>
-            </w:pPr>
-            <w:r>
-              <w:rPr>
-                <w:rFonts w:ascii="Calibri" w:hAnsi="Calibri"/>
-                <w:b w:val="0"/>
-                <w:i w:val="0"/>
-                <w:color w:val="CCDDEE"/>
-                <w:sz w:val="18"/>
-              </w:rPr>
-              <w:t>💻  github.com/AbiolaAdegbola</w:t>
-            </w:r>
-          </w:p>
-        </w:tc>
-      </w:tr>
-    </w:tbl>
-    <w:p/>
-    <w:p>
-      <w:pPr>
-        <w:spacing w:before="200" w:after="40"/>
-        <w:jc w:val="left"/>
-      </w:pPr>
-      <w:r>
-        <w:rPr>
-          <w:rFonts w:ascii="Calibri" w:hAnsi="Calibri"/>
-          <w:b/>
-          <w:i w:val="0"/>
-          <w:caps/>
-          <w:color w:val="163753"/>
-          <w:sz w:val="22"/>
-        </w:rPr>
-        <w:t>PROFIL PROFESSIONNEL</w:t>
-      </w:r>
-    </w:p>
-    <w:p>
-      <w:pPr>
-        <w:spacing w:before="40" w:after="40"/>
-        <w:pBdr>
-          <w:bottom w:val="single" w:sz="6" w:space="1" w:color="163753"/>
-        </w:pBdr>
-      </w:pPr>
-    </w:p>
-    <w:p>
-      <w:pPr>
-        <w:spacing w:before="60" w:after="60"/>
-        <w:jc w:val="left"/>
-      </w:pPr>
-      <w:r>
-        <w:rPr>
-          <w:rFonts w:ascii="Calibri" w:hAnsi="Calibri"/>
-          <w:b w:val="0"/>
-          <w:i w:val="0"/>
-          <w:color w:val="555555"/>
-          <w:sz w:val="19"/>
-        </w:rPr>
-        <w:t>Ingénieur IT passionné avec 3+ années d'expérience en développement full-stack, gestion de projets SI et pilotage d'infrastructures informatiques. Spécialisé dans la transformation digitale des organisations, je conçois et déploie des solutions métier adaptées aux contraintes terrain (ERP, CRM, applications mobiles, IoT). Leadership démontré en contexte startup et corporate, avec une forte orientation résultats et innovation.</w:t>
-      </w:r>
-    </w:p>
-    <w:p>
-      <w:pPr>
-        <w:spacing w:before="200" w:after="40"/>
-        <w:jc w:val="left"/>
-      </w:pPr>
-      <w:r>
-        <w:rPr>
-          <w:rFonts w:ascii="Calibri" w:hAnsi="Calibri"/>
-          <w:b/>
-          <w:i w:val="0"/>
-          <w:caps/>
-          <w:color w:val="163753"/>
-          <w:sz w:val="22"/>
-        </w:rPr>
-        <w:t>EXPÉRIENCES PROFESSIONNELLES</w:t>
-      </w:r>
-    </w:p>
-    <w:p>
-      <w:pPr>
-        <w:spacing w:before="40" w:after="40"/>
-        <w:pBdr>
-          <w:bottom w:val="single" w:sz="6" w:space="1" w:color="163753"/>
-        </w:pBdr>
-      </w:pPr>
-    </w:p>
-    <w:tbl>
-      <w:tblPr>
-        <w:tblStyle w:val="TableGrid"/>
-        <w:tblW w:type="auto" w:w="0"/>
-        <w:tblLook w:firstColumn="1" w:firstRow="1" w:lastColumn="0" w:lastRow="0" w:noHBand="0" w:noVBand="1" w:val="04A0"/>
-      </w:tblPr>
-      <w:tblGrid>
-        <w:gridCol w:w="4933"/>
-        <w:gridCol w:w="4933"/>
-      </w:tblGrid>
-      <w:tr>
-        <w:tc>
-          <w:tcPr>
-            <w:tcW w:type="dxa" w:w="6236"/>
-            <w:tcBdr>
-              <w:top w:val="none" w:sz="0" w:space="0" w:color="auto"/>
-            </w:tcBdr>
-            <w:tcBdr>
-              <w:left w:val="none" w:sz="0" w:space="0" w:color="auto"/>
-            </w:tcBdr>
-            <w:tcBdr>
-              <w:bottom w:val="none" w:sz="0" w:space="0" w:color="auto"/>
-            </w:tcBdr>
-            <w:tcBdr>
-              <w:right w:val="none" w:sz="0" w:space="0" w:color="auto"/>
-            </w:tcBdr>
-            <w:tcMar>
-              <w:top w:w="0" w:type="dxa"/>
-              <w:start w:w="0" w:type="dxa"/>
-              <w:bottom w:w="0" w:type="dxa"/>
-              <w:end w:w="100" w:type="dxa"/>
-            </w:tcMar>
-          </w:tcPr>
-          <w:p>
-            <w:pPr>
-              <w:spacing w:before="0" w:after="0"/>
-              <w:jc w:val="left"/>
+              <w:tabs>
+                <w:tab w:pos="7483" w:val="right"/>
+              </w:tabs>
+              <w:spacing w:before="120" w:after="0"/>
             </w:pPr>
             <w:r>
               <w:rPr>
                 <w:rFonts w:ascii="Calibri" w:hAnsi="Calibri"/>
                 <w:b/>
-                <w:i w:val="0"/>
-                <w:color w:val="163753"/>
+                <w:color w:val="0F2A3F"/>
                 <w:sz w:val="20"/>
               </w:rPr>
               <w:t>Responsable IT &amp; Chef de Projets Digitaux</w:t>
             </w:r>
+            <w:r>
+              <w:rPr>
+                <w:rFonts w:ascii="Calibri" w:hAnsi="Calibri"/>
+                <w:i/>
+                <w:color w:val="9999AA"/>
+                <w:sz w:val="17"/>
+              </w:rPr>
+              <w:tab/>
+              <w:t>2024 – Présent</w:t>
+            </w:r>
           </w:p>
           <w:p>
             <w:pPr>
-              <w:spacing w:before="0" w:after="20"/>
+              <w:spacing w:before="0" w:after="40"/>
             </w:pPr>
             <w:r>
               <w:rPr>
                 <w:rFonts w:ascii="Calibri" w:hAnsi="Calibri"/>
-                <w:b w:val="0"/>
                 <w:i/>
-                <w:color w:val="0078D4"/>
+                <w:color w:val="1A8CD8"/>
                 <w:sz w:val="19"/>
               </w:rPr>
               <w:t>Green Agro Valley</w:t>
@@ -327,246 +1021,159 @@
             <w:r>
               <w:rPr>
                 <w:rFonts w:ascii="Calibri" w:hAnsi="Calibri"/>
-                <w:b w:val="0"/>
-                <w:i w:val="0"/>
-                <w:color w:val="AAAAAA"/>
-                <w:sz w:val="18"/>
+                <w:color w:val="9999AA"/>
+                <w:sz w:val="17"/>
               </w:rPr>
               <w:t xml:space="preserve">  ·  Abidjan, CI</w:t>
             </w:r>
           </w:p>
-        </w:tc>
-        <w:tc>
-          <w:tcPr>
-            <w:tcW w:type="dxa" w:w="3402"/>
-            <w:tcBdr>
-              <w:top w:val="none" w:sz="0" w:space="0" w:color="auto"/>
-            </w:tcBdr>
-            <w:tcBdr>
-              <w:left w:val="none" w:sz="0" w:space="0" w:color="auto"/>
-            </w:tcBdr>
-            <w:tcBdr>
-              <w:bottom w:val="none" w:sz="0" w:space="0" w:color="auto"/>
-            </w:tcBdr>
-            <w:tcBdr>
-              <w:right w:val="none" w:sz="0" w:space="0" w:color="auto"/>
-            </w:tcBdr>
-            <w:tcMar>
-              <w:top w:w="0" w:type="dxa"/>
-              <w:start w:w="0" w:type="dxa"/>
-              <w:bottom w:w="0" w:type="dxa"/>
-              <w:end w:w="0" w:type="dxa"/>
-            </w:tcMar>
-          </w:tcPr>
           <w:p>
             <w:pPr>
-              <w:spacing w:before="0" w:after="0"/>
-              <w:jc w:val="right"/>
+              <w:spacing w:before="20" w:after="0"/>
+              <w:ind w:left="227" w:hanging="170"/>
             </w:pPr>
             <w:r>
               <w:rPr>
                 <w:rFonts w:ascii="Calibri" w:hAnsi="Calibri"/>
-                <w:b w:val="0"/>
-                <w:i/>
-                <w:color w:val="AAAAAA"/>
+                <w:color w:val="1A8CD8"/>
                 <w:sz w:val="18"/>
               </w:rPr>
-              <w:t>2024 – Présent</w:t>
+              <w:t xml:space="preserve">▸  </w:t>
+            </w:r>
+            <w:r>
+              <w:rPr>
+                <w:rFonts w:ascii="Calibri" w:hAnsi="Calibri"/>
+                <w:color w:val="444455"/>
+                <w:sz w:val="18"/>
+              </w:rPr>
+              <w:t>Pilotage de la transformation digitale : déploiement ERP agricole + traçabilité IoT</w:t>
             </w:r>
           </w:p>
-        </w:tc>
-      </w:tr>
-    </w:tbl>
-    <w:p>
-      <w:pPr>
-        <w:spacing w:before="20" w:after="0"/>
-        <w:ind w:left="283" w:hanging="170"/>
-      </w:pPr>
-      <w:r>
-        <w:rPr>
-          <w:rFonts w:ascii="Calibri" w:hAnsi="Calibri"/>
-          <w:b w:val="0"/>
-          <w:i w:val="0"/>
-          <w:color w:val="0078D4"/>
-          <w:sz w:val="18"/>
-        </w:rPr>
-        <w:t xml:space="preserve">▸  </w:t>
-      </w:r>
-      <w:r>
-        <w:rPr>
-          <w:rFonts w:ascii="Calibri" w:hAnsi="Calibri"/>
-          <w:b w:val="0"/>
-          <w:i w:val="0"/>
-          <w:color w:val="555555"/>
-          <w:sz w:val="19"/>
-        </w:rPr>
-        <w:t>Pilotage de la transformation digitale : déploiement d'un ERP agricole et d'un système de traçabilité IoT</w:t>
-      </w:r>
-    </w:p>
-    <w:p>
-      <w:pPr>
-        <w:spacing w:before="20" w:after="0"/>
-        <w:ind w:left="283" w:hanging="170"/>
-      </w:pPr>
-      <w:r>
-        <w:rPr>
-          <w:rFonts w:ascii="Calibri" w:hAnsi="Calibri"/>
-          <w:b w:val="0"/>
-          <w:i w:val="0"/>
-          <w:color w:val="0078D4"/>
-          <w:sz w:val="18"/>
-        </w:rPr>
-        <w:t xml:space="preserve">▸  </w:t>
-      </w:r>
-      <w:r>
-        <w:rPr>
-          <w:rFonts w:ascii="Calibri" w:hAnsi="Calibri"/>
-          <w:b w:val="0"/>
-          <w:i w:val="0"/>
-          <w:color w:val="555555"/>
-          <w:sz w:val="19"/>
-        </w:rPr>
-        <w:t>Management d'une équipe de 4 développeurs et coordination avec les prestataires externes</w:t>
-      </w:r>
-    </w:p>
-    <w:p>
-      <w:pPr>
-        <w:spacing w:before="20" w:after="0"/>
-        <w:ind w:left="283" w:hanging="170"/>
-      </w:pPr>
-      <w:r>
-        <w:rPr>
-          <w:rFonts w:ascii="Calibri" w:hAnsi="Calibri"/>
-          <w:b w:val="0"/>
-          <w:i w:val="0"/>
-          <w:color w:val="0078D4"/>
-          <w:sz w:val="18"/>
-        </w:rPr>
-        <w:t xml:space="preserve">▸  </w:t>
-      </w:r>
-      <w:r>
-        <w:rPr>
-          <w:rFonts w:ascii="Calibri" w:hAnsi="Calibri"/>
-          <w:b w:val="0"/>
-          <w:i w:val="0"/>
-          <w:color w:val="555555"/>
-          <w:sz w:val="19"/>
-        </w:rPr>
-        <w:t>Mise en place d'une infrastructure GCP (Cloud SQL, Cloud Run, Firebase) pour les applications métier</w:t>
-      </w:r>
-    </w:p>
-    <w:p>
-      <w:pPr>
-        <w:spacing w:before="20" w:after="0"/>
-        <w:ind w:left="283" w:hanging="170"/>
-      </w:pPr>
-      <w:r>
-        <w:rPr>
-          <w:rFonts w:ascii="Calibri" w:hAnsi="Calibri"/>
-          <w:b w:val="0"/>
-          <w:i w:val="0"/>
-          <w:color w:val="0078D4"/>
-          <w:sz w:val="18"/>
-        </w:rPr>
-        <w:t xml:space="preserve">▸  </w:t>
-      </w:r>
-      <w:r>
-        <w:rPr>
-          <w:rFonts w:ascii="Calibri" w:hAnsi="Calibri"/>
-          <w:b w:val="0"/>
-          <w:i w:val="0"/>
-          <w:color w:val="555555"/>
-          <w:sz w:val="19"/>
-        </w:rPr>
-        <w:t>Développement et intégration de l'application mobile AgriMarket (Flutter / Node.js)</w:t>
-      </w:r>
-    </w:p>
-    <w:p>
-      <w:pPr>
-        <w:spacing w:before="20" w:after="0"/>
-        <w:ind w:left="283" w:hanging="170"/>
-      </w:pPr>
-      <w:r>
-        <w:rPr>
-          <w:rFonts w:ascii="Calibri" w:hAnsi="Calibri"/>
-          <w:b w:val="0"/>
-          <w:i w:val="0"/>
-          <w:color w:val="0078D4"/>
-          <w:sz w:val="18"/>
-        </w:rPr>
-        <w:t xml:space="preserve">▸  </w:t>
-      </w:r>
-      <w:r>
-        <w:rPr>
-          <w:rFonts w:ascii="Calibri" w:hAnsi="Calibri"/>
-          <w:b w:val="0"/>
-          <w:i w:val="0"/>
-          <w:color w:val="555555"/>
-          <w:sz w:val="19"/>
-        </w:rPr>
-        <w:t>Réduction de 30% des délais de reporting grâce à l'automatisation des workflows</w:t>
-      </w:r>
-    </w:p>
-    <w:p/>
-    <w:tbl>
-      <w:tblPr>
-        <w:tblStyle w:val="TableGrid"/>
-        <w:tblW w:type="auto" w:w="0"/>
-        <w:tblLook w:firstColumn="1" w:firstRow="1" w:lastColumn="0" w:lastRow="0" w:noHBand="0" w:noVBand="1" w:val="04A0"/>
-      </w:tblPr>
-      <w:tblGrid>
-        <w:gridCol w:w="4933"/>
-        <w:gridCol w:w="4933"/>
-      </w:tblGrid>
-      <w:tr>
-        <w:tc>
-          <w:tcPr>
-            <w:tcW w:type="dxa" w:w="6236"/>
-            <w:tcBdr>
-              <w:top w:val="none" w:sz="0" w:space="0" w:color="auto"/>
-            </w:tcBdr>
-            <w:tcBdr>
-              <w:left w:val="none" w:sz="0" w:space="0" w:color="auto"/>
-            </w:tcBdr>
-            <w:tcBdr>
-              <w:bottom w:val="none" w:sz="0" w:space="0" w:color="auto"/>
-            </w:tcBdr>
-            <w:tcBdr>
-              <w:right w:val="none" w:sz="0" w:space="0" w:color="auto"/>
-            </w:tcBdr>
-            <w:tcMar>
-              <w:top w:w="0" w:type="dxa"/>
-              <w:start w:w="0" w:type="dxa"/>
-              <w:bottom w:w="0" w:type="dxa"/>
-              <w:end w:w="100" w:type="dxa"/>
-            </w:tcMar>
-          </w:tcPr>
           <w:p>
             <w:pPr>
-              <w:spacing w:before="0" w:after="0"/>
-              <w:jc w:val="left"/>
+              <w:spacing w:before="20" w:after="0"/>
+              <w:ind w:left="227" w:hanging="170"/>
+            </w:pPr>
+            <w:r>
+              <w:rPr>
+                <w:rFonts w:ascii="Calibri" w:hAnsi="Calibri"/>
+                <w:color w:val="1A8CD8"/>
+                <w:sz w:val="18"/>
+              </w:rPr>
+              <w:t xml:space="preserve">▸  </w:t>
+            </w:r>
+            <w:r>
+              <w:rPr>
+                <w:rFonts w:ascii="Calibri" w:hAnsi="Calibri"/>
+                <w:color w:val="444455"/>
+                <w:sz w:val="18"/>
+              </w:rPr>
+              <w:t>Management d'une équipe de 4 développeurs, coordination prestataires externes</w:t>
+            </w:r>
+          </w:p>
+          <w:p>
+            <w:pPr>
+              <w:spacing w:before="20" w:after="0"/>
+              <w:ind w:left="227" w:hanging="170"/>
+            </w:pPr>
+            <w:r>
+              <w:rPr>
+                <w:rFonts w:ascii="Calibri" w:hAnsi="Calibri"/>
+                <w:color w:val="1A8CD8"/>
+                <w:sz w:val="18"/>
+              </w:rPr>
+              <w:t xml:space="preserve">▸  </w:t>
+            </w:r>
+            <w:r>
+              <w:rPr>
+                <w:rFonts w:ascii="Calibri" w:hAnsi="Calibri"/>
+                <w:color w:val="444455"/>
+                <w:sz w:val="18"/>
+              </w:rPr>
+              <w:t>Infrastructure GCP (Cloud SQL, Cloud Run, Firebase) pour les applications métier</w:t>
+            </w:r>
+          </w:p>
+          <w:p>
+            <w:pPr>
+              <w:spacing w:before="20" w:after="0"/>
+              <w:ind w:left="227" w:hanging="170"/>
+            </w:pPr>
+            <w:r>
+              <w:rPr>
+                <w:rFonts w:ascii="Calibri" w:hAnsi="Calibri"/>
+                <w:color w:val="1A8CD8"/>
+                <w:sz w:val="18"/>
+              </w:rPr>
+              <w:t xml:space="preserve">▸  </w:t>
+            </w:r>
+            <w:r>
+              <w:rPr>
+                <w:rFonts w:ascii="Calibri" w:hAnsi="Calibri"/>
+                <w:color w:val="444455"/>
+                <w:sz w:val="18"/>
+              </w:rPr>
+              <w:t>Développement mobile AgriMarket (Flutter / Node.js) — 500+ utilisateurs actifs</w:t>
+            </w:r>
+          </w:p>
+          <w:p>
+            <w:pPr>
+              <w:spacing w:before="20" w:after="0"/>
+              <w:ind w:left="227" w:hanging="170"/>
+            </w:pPr>
+            <w:r>
+              <w:rPr>
+                <w:rFonts w:ascii="Calibri" w:hAnsi="Calibri"/>
+                <w:color w:val="1A8CD8"/>
+                <w:sz w:val="18"/>
+              </w:rPr>
+              <w:t xml:space="preserve">▸  </w:t>
+            </w:r>
+            <w:r>
+              <w:rPr>
+                <w:rFonts w:ascii="Calibri" w:hAnsi="Calibri"/>
+                <w:color w:val="444455"/>
+                <w:sz w:val="18"/>
+              </w:rPr>
+              <w:t>Automatisation des workflows → réduction de 30% des délais de reporting</w:t>
+            </w:r>
+          </w:p>
+          <w:p/>
+          <w:p>
+            <w:pPr>
+              <w:tabs>
+                <w:tab w:pos="7483" w:val="right"/>
+              </w:tabs>
+              <w:spacing w:before="120" w:after="0"/>
             </w:pPr>
             <w:r>
               <w:rPr>
                 <w:rFonts w:ascii="Calibri" w:hAnsi="Calibri"/>
                 <w:b/>
-                <w:i w:val="0"/>
-                <w:color w:val="163753"/>
+                <w:color w:val="0F2A3F"/>
                 <w:sz w:val="20"/>
               </w:rPr>
               <w:t>Développeur Full Stack &amp; Ingénieur Systèmes</w:t>
             </w:r>
+            <w:r>
+              <w:rPr>
+                <w:rFonts w:ascii="Calibri" w:hAnsi="Calibri"/>
+                <w:i/>
+                <w:color w:val="9999AA"/>
+                <w:sz w:val="17"/>
+              </w:rPr>
+              <w:tab/>
+              <w:t>2023 – 2024</w:t>
+            </w:r>
           </w:p>
           <w:p>
             <w:pPr>
-              <w:spacing w:before="0" w:after="20"/>
+              <w:spacing w:before="0" w:after="40"/>
             </w:pPr>
             <w:r>
               <w:rPr>
                 <w:rFonts w:ascii="Calibri" w:hAnsi="Calibri"/>
-                <w:b w:val="0"/>
                 <w:i/>
-                <w:color w:val="0078D4"/>
+                <w:color w:val="1A8CD8"/>
                 <w:sz w:val="19"/>
               </w:rPr>
               <w:t>CE.S.A.M La Diagnose</w:t>
@@ -574,220 +1181,115 @@
             <w:r>
               <w:rPr>
                 <w:rFonts w:ascii="Calibri" w:hAnsi="Calibri"/>
-                <w:b w:val="0"/>
-                <w:i w:val="0"/>
-                <w:color w:val="AAAAAA"/>
-                <w:sz w:val="18"/>
+                <w:color w:val="9999AA"/>
+                <w:sz w:val="17"/>
               </w:rPr>
               <w:t xml:space="preserve">  ·  Abidjan, CI</w:t>
             </w:r>
           </w:p>
-        </w:tc>
-        <w:tc>
-          <w:tcPr>
-            <w:tcW w:type="dxa" w:w="3402"/>
-            <w:tcBdr>
-              <w:top w:val="none" w:sz="0" w:space="0" w:color="auto"/>
-            </w:tcBdr>
-            <w:tcBdr>
-              <w:left w:val="none" w:sz="0" w:space="0" w:color="auto"/>
-            </w:tcBdr>
-            <w:tcBdr>
-              <w:bottom w:val="none" w:sz="0" w:space="0" w:color="auto"/>
-            </w:tcBdr>
-            <w:tcBdr>
-              <w:right w:val="none" w:sz="0" w:space="0" w:color="auto"/>
-            </w:tcBdr>
-            <w:tcMar>
-              <w:top w:w="0" w:type="dxa"/>
-              <w:start w:w="0" w:type="dxa"/>
-              <w:bottom w:w="0" w:type="dxa"/>
-              <w:end w:w="0" w:type="dxa"/>
-            </w:tcMar>
-          </w:tcPr>
           <w:p>
             <w:pPr>
-              <w:spacing w:before="0" w:after="0"/>
-              <w:jc w:val="right"/>
+              <w:spacing w:before="20" w:after="0"/>
+              <w:ind w:left="227" w:hanging="170"/>
             </w:pPr>
             <w:r>
               <w:rPr>
                 <w:rFonts w:ascii="Calibri" w:hAnsi="Calibri"/>
-                <w:b w:val="0"/>
-                <w:i/>
-                <w:color w:val="AAAAAA"/>
+                <w:color w:val="1A8CD8"/>
                 <w:sz w:val="18"/>
               </w:rPr>
-              <w:t>2023 – 2024</w:t>
+              <w:t xml:space="preserve">▸  </w:t>
+            </w:r>
+            <w:r>
+              <w:rPr>
+                <w:rFonts w:ascii="Calibri" w:hAnsi="Calibri"/>
+                <w:color w:val="444455"/>
+                <w:sz w:val="18"/>
+              </w:rPr>
+              <w:t>Plateforme web de gestion des diagnostics médicaux (React + PHP/Laravel)</w:t>
             </w:r>
           </w:p>
-        </w:tc>
-      </w:tr>
-    </w:tbl>
-    <w:p>
-      <w:pPr>
-        <w:spacing w:before="20" w:after="0"/>
-        <w:ind w:left="283" w:hanging="170"/>
-      </w:pPr>
-      <w:r>
-        <w:rPr>
-          <w:rFonts w:ascii="Calibri" w:hAnsi="Calibri"/>
-          <w:b w:val="0"/>
-          <w:i w:val="0"/>
-          <w:color w:val="0078D4"/>
-          <w:sz w:val="18"/>
-        </w:rPr>
-        <w:t xml:space="preserve">▸  </w:t>
-      </w:r>
-      <w:r>
-        <w:rPr>
-          <w:rFonts w:ascii="Calibri" w:hAnsi="Calibri"/>
-          <w:b w:val="0"/>
-          <w:i w:val="0"/>
-          <w:color w:val="555555"/>
-          <w:sz w:val="19"/>
-        </w:rPr>
-        <w:t>Développement d'une plateforme web de gestion des diagnostics médicaux (React + PHP/Laravel)</w:t>
-      </w:r>
-    </w:p>
-    <w:p>
-      <w:pPr>
-        <w:spacing w:before="20" w:after="0"/>
-        <w:ind w:left="283" w:hanging="170"/>
-      </w:pPr>
-      <w:r>
-        <w:rPr>
-          <w:rFonts w:ascii="Calibri" w:hAnsi="Calibri"/>
-          <w:b w:val="0"/>
-          <w:i w:val="0"/>
-          <w:color w:val="0078D4"/>
-          <w:sz w:val="18"/>
-        </w:rPr>
-        <w:t xml:space="preserve">▸  </w:t>
-      </w:r>
-      <w:r>
-        <w:rPr>
-          <w:rFonts w:ascii="Calibri" w:hAnsi="Calibri"/>
-          <w:b w:val="0"/>
-          <w:i w:val="0"/>
-          <w:color w:val="555555"/>
-          <w:sz w:val="19"/>
-        </w:rPr>
-        <w:t>Intégration d'APIs tierces (SMS, paiement mobile) et sécurisation RGPD des données patients</w:t>
-      </w:r>
-    </w:p>
-    <w:p>
-      <w:pPr>
-        <w:spacing w:before="20" w:after="0"/>
-        <w:ind w:left="283" w:hanging="170"/>
-      </w:pPr>
-      <w:r>
-        <w:rPr>
-          <w:rFonts w:ascii="Calibri" w:hAnsi="Calibri"/>
-          <w:b w:val="0"/>
-          <w:i w:val="0"/>
-          <w:color w:val="0078D4"/>
-          <w:sz w:val="18"/>
-        </w:rPr>
-        <w:t xml:space="preserve">▸  </w:t>
-      </w:r>
-      <w:r>
-        <w:rPr>
-          <w:rFonts w:ascii="Calibri" w:hAnsi="Calibri"/>
-          <w:b w:val="0"/>
-          <w:i w:val="0"/>
-          <w:color w:val="555555"/>
-          <w:sz w:val="19"/>
-        </w:rPr>
-        <w:t>Maintenance et optimisation de l'infrastructure serveur (Linux, Nginx, MySQL)</w:t>
-      </w:r>
-    </w:p>
-    <w:p>
-      <w:pPr>
-        <w:spacing w:before="20" w:after="0"/>
-        <w:ind w:left="283" w:hanging="170"/>
-      </w:pPr>
-      <w:r>
-        <w:rPr>
-          <w:rFonts w:ascii="Calibri" w:hAnsi="Calibri"/>
-          <w:b w:val="0"/>
-          <w:i w:val="0"/>
-          <w:color w:val="0078D4"/>
-          <w:sz w:val="18"/>
-        </w:rPr>
-        <w:t xml:space="preserve">▸  </w:t>
-      </w:r>
-      <w:r>
-        <w:rPr>
-          <w:rFonts w:ascii="Calibri" w:hAnsi="Calibri"/>
-          <w:b w:val="0"/>
-          <w:i w:val="0"/>
-          <w:color w:val="555555"/>
-          <w:sz w:val="19"/>
-        </w:rPr>
-        <w:t>Formation des équipes métier aux nouveaux outils numériques</w:t>
-      </w:r>
-    </w:p>
-    <w:p/>
-    <w:tbl>
-      <w:tblPr>
-        <w:tblStyle w:val="TableGrid"/>
-        <w:tblW w:type="auto" w:w="0"/>
-        <w:tblLook w:firstColumn="1" w:firstRow="1" w:lastColumn="0" w:lastRow="0" w:noHBand="0" w:noVBand="1" w:val="04A0"/>
-      </w:tblPr>
-      <w:tblGrid>
-        <w:gridCol w:w="4933"/>
-        <w:gridCol w:w="4933"/>
-      </w:tblGrid>
-      <w:tr>
-        <w:tc>
-          <w:tcPr>
-            <w:tcW w:type="dxa" w:w="6236"/>
-            <w:tcBdr>
-              <w:top w:val="none" w:sz="0" w:space="0" w:color="auto"/>
-            </w:tcBdr>
-            <w:tcBdr>
-              <w:left w:val="none" w:sz="0" w:space="0" w:color="auto"/>
-            </w:tcBdr>
-            <w:tcBdr>
-              <w:bottom w:val="none" w:sz="0" w:space="0" w:color="auto"/>
-            </w:tcBdr>
-            <w:tcBdr>
-              <w:right w:val="none" w:sz="0" w:space="0" w:color="auto"/>
-            </w:tcBdr>
-            <w:tcMar>
-              <w:top w:w="0" w:type="dxa"/>
-              <w:start w:w="0" w:type="dxa"/>
-              <w:bottom w:w="0" w:type="dxa"/>
-              <w:end w:w="100" w:type="dxa"/>
-            </w:tcMar>
-          </w:tcPr>
           <w:p>
             <w:pPr>
-              <w:spacing w:before="0" w:after="0"/>
-              <w:jc w:val="left"/>
+              <w:spacing w:before="20" w:after="0"/>
+              <w:ind w:left="227" w:hanging="170"/>
+            </w:pPr>
+            <w:r>
+              <w:rPr>
+                <w:rFonts w:ascii="Calibri" w:hAnsi="Calibri"/>
+                <w:color w:val="1A8CD8"/>
+                <w:sz w:val="18"/>
+              </w:rPr>
+              <w:t xml:space="preserve">▸  </w:t>
+            </w:r>
+            <w:r>
+              <w:rPr>
+                <w:rFonts w:ascii="Calibri" w:hAnsi="Calibri"/>
+                <w:color w:val="444455"/>
+                <w:sz w:val="18"/>
+              </w:rPr>
+              <w:t>Intégration APIs tierces (SMS, paiement mobile), sécurisation RGPD des données</w:t>
+            </w:r>
+          </w:p>
+          <w:p>
+            <w:pPr>
+              <w:spacing w:before="20" w:after="0"/>
+              <w:ind w:left="227" w:hanging="170"/>
+            </w:pPr>
+            <w:r>
+              <w:rPr>
+                <w:rFonts w:ascii="Calibri" w:hAnsi="Calibri"/>
+                <w:color w:val="1A8CD8"/>
+                <w:sz w:val="18"/>
+              </w:rPr>
+              <w:t xml:space="preserve">▸  </w:t>
+            </w:r>
+            <w:r>
+              <w:rPr>
+                <w:rFonts w:ascii="Calibri" w:hAnsi="Calibri"/>
+                <w:color w:val="444455"/>
+                <w:sz w:val="18"/>
+              </w:rPr>
+              <w:t>Maintenance infrastructure serveur Linux/Nginx/MySQL</w:t>
+            </w:r>
+          </w:p>
+          <w:p/>
+          <w:p>
+            <w:pPr>
+              <w:tabs>
+                <w:tab w:pos="7483" w:val="right"/>
+              </w:tabs>
+              <w:spacing w:before="120" w:after="0"/>
             </w:pPr>
             <w:r>
               <w:rPr>
                 <w:rFonts w:ascii="Calibri" w:hAnsi="Calibri"/>
                 <w:b/>
-                <w:i w:val="0"/>
-                <w:color w:val="163753"/>
+                <w:color w:val="0F2A3F"/>
                 <w:sz w:val="20"/>
               </w:rPr>
               <w:t>Co-fondateur &amp; CEO</w:t>
             </w:r>
+            <w:r>
+              <w:rPr>
+                <w:rFonts w:ascii="Calibri" w:hAnsi="Calibri"/>
+                <w:i/>
+                <w:color w:val="9999AA"/>
+                <w:sz w:val="17"/>
+              </w:rPr>
+              <w:tab/>
+              <w:t>2023 – Présent</w:t>
+            </w:r>
           </w:p>
           <w:p>
             <w:pPr>
-              <w:spacing w:before="0" w:after="20"/>
+              <w:spacing w:before="0" w:after="40"/>
             </w:pPr>
             <w:r>
               <w:rPr>
                 <w:rFonts w:ascii="Calibri" w:hAnsi="Calibri"/>
-                <w:b w:val="0"/>
                 <w:i/>
-                <w:color w:val="0078D4"/>
+                <w:color w:val="1A8CD8"/>
                 <w:sz w:val="19"/>
               </w:rPr>
               <w:t>Ivoire Booking</w:t>
@@ -795,389 +1297,115 @@
             <w:r>
               <w:rPr>
                 <w:rFonts w:ascii="Calibri" w:hAnsi="Calibri"/>
-                <w:b w:val="0"/>
-                <w:i w:val="0"/>
-                <w:color w:val="AAAAAA"/>
-                <w:sz w:val="18"/>
+                <w:color w:val="9999AA"/>
+                <w:sz w:val="17"/>
               </w:rPr>
               <w:t xml:space="preserve">  ·  Côte d'Ivoire</w:t>
             </w:r>
           </w:p>
-        </w:tc>
-        <w:tc>
-          <w:tcPr>
-            <w:tcW w:type="dxa" w:w="3402"/>
-            <w:tcBdr>
-              <w:top w:val="none" w:sz="0" w:space="0" w:color="auto"/>
-            </w:tcBdr>
-            <w:tcBdr>
-              <w:left w:val="none" w:sz="0" w:space="0" w:color="auto"/>
-            </w:tcBdr>
-            <w:tcBdr>
-              <w:bottom w:val="none" w:sz="0" w:space="0" w:color="auto"/>
-            </w:tcBdr>
-            <w:tcBdr>
-              <w:right w:val="none" w:sz="0" w:space="0" w:color="auto"/>
-            </w:tcBdr>
-            <w:tcMar>
-              <w:top w:w="0" w:type="dxa"/>
-              <w:start w:w="0" w:type="dxa"/>
-              <w:bottom w:w="0" w:type="dxa"/>
-              <w:end w:w="0" w:type="dxa"/>
-            </w:tcMar>
-          </w:tcPr>
           <w:p>
             <w:pPr>
-              <w:spacing w:before="0" w:after="0"/>
-              <w:jc w:val="right"/>
+              <w:spacing w:before="20" w:after="0"/>
+              <w:ind w:left="227" w:hanging="170"/>
             </w:pPr>
             <w:r>
               <w:rPr>
                 <w:rFonts w:ascii="Calibri" w:hAnsi="Calibri"/>
-                <w:b w:val="0"/>
-                <w:i/>
-                <w:color w:val="AAAAAA"/>
+                <w:color w:val="1A8CD8"/>
                 <w:sz w:val="18"/>
               </w:rPr>
-              <w:t>2023 – Présent</w:t>
+              <w:t xml:space="preserve">▸  </w:t>
+            </w:r>
+            <w:r>
+              <w:rPr>
+                <w:rFonts w:ascii="Calibri" w:hAnsi="Calibri"/>
+                <w:color w:val="444455"/>
+                <w:sz w:val="18"/>
+              </w:rPr>
+              <w:t>Création d'une plateforme de réservation événementielle — 200+ prestataires référencés</w:t>
             </w:r>
           </w:p>
-        </w:tc>
-      </w:tr>
-    </w:tbl>
-    <w:p>
-      <w:pPr>
-        <w:spacing w:before="20" w:after="0"/>
-        <w:ind w:left="283" w:hanging="170"/>
-      </w:pPr>
-      <w:r>
-        <w:rPr>
-          <w:rFonts w:ascii="Calibri" w:hAnsi="Calibri"/>
-          <w:b w:val="0"/>
-          <w:i w:val="0"/>
-          <w:color w:val="0078D4"/>
-          <w:sz w:val="18"/>
-        </w:rPr>
-        <w:t xml:space="preserve">▸  </w:t>
-      </w:r>
-      <w:r>
-        <w:rPr>
-          <w:rFonts w:ascii="Calibri" w:hAnsi="Calibri"/>
-          <w:b w:val="0"/>
-          <w:i w:val="0"/>
-          <w:color w:val="555555"/>
-          <w:sz w:val="19"/>
-        </w:rPr>
-        <w:t>Création et pilotage d'une plateforme de réservation en ligne pour prestataires événementiels</w:t>
-      </w:r>
-    </w:p>
-    <w:p>
-      <w:pPr>
-        <w:spacing w:before="20" w:after="0"/>
-        <w:ind w:left="283" w:hanging="170"/>
-      </w:pPr>
-      <w:r>
-        <w:rPr>
-          <w:rFonts w:ascii="Calibri" w:hAnsi="Calibri"/>
-          <w:b w:val="0"/>
-          <w:i w:val="0"/>
-          <w:color w:val="0078D4"/>
-          <w:sz w:val="18"/>
-        </w:rPr>
-        <w:t xml:space="preserve">▸  </w:t>
-      </w:r>
-      <w:r>
-        <w:rPr>
-          <w:rFonts w:ascii="Calibri" w:hAnsi="Calibri"/>
-          <w:b w:val="0"/>
-          <w:i w:val="0"/>
-          <w:color w:val="555555"/>
-          <w:sz w:val="19"/>
-        </w:rPr>
-        <w:t>Développement from scratch : React.js, Node.js, MongoDB, intégration paiement Cinetpay/Wave</w:t>
-      </w:r>
-    </w:p>
-    <w:p>
-      <w:pPr>
-        <w:spacing w:before="20" w:after="0"/>
-        <w:ind w:left="283" w:hanging="170"/>
-      </w:pPr>
-      <w:r>
-        <w:rPr>
-          <w:rFonts w:ascii="Calibri" w:hAnsi="Calibri"/>
-          <w:b w:val="0"/>
-          <w:i w:val="0"/>
-          <w:color w:val="0078D4"/>
-          <w:sz w:val="18"/>
-        </w:rPr>
-        <w:t xml:space="preserve">▸  </w:t>
-      </w:r>
-      <w:r>
-        <w:rPr>
-          <w:rFonts w:ascii="Calibri" w:hAnsi="Calibri"/>
-          <w:b w:val="0"/>
-          <w:i w:val="0"/>
-          <w:color w:val="555555"/>
-          <w:sz w:val="19"/>
-        </w:rPr>
-        <w:t>Acquisition de 200+ prestataires référencés en 12 mois</w:t>
-      </w:r>
-    </w:p>
-    <w:p>
-      <w:pPr>
-        <w:spacing w:before="20" w:after="0"/>
-        <w:ind w:left="283" w:hanging="170"/>
-      </w:pPr>
-      <w:r>
-        <w:rPr>
-          <w:rFonts w:ascii="Calibri" w:hAnsi="Calibri"/>
-          <w:b w:val="0"/>
-          <w:i w:val="0"/>
-          <w:color w:val="0078D4"/>
-          <w:sz w:val="18"/>
-        </w:rPr>
-        <w:t xml:space="preserve">▸  </w:t>
-      </w:r>
-      <w:r>
-        <w:rPr>
-          <w:rFonts w:ascii="Calibri" w:hAnsi="Calibri"/>
-          <w:b w:val="0"/>
-          <w:i w:val="0"/>
-          <w:color w:val="555555"/>
-          <w:sz w:val="19"/>
-        </w:rPr>
-        <w:t>Gestion produit, roadmap technique et levée de fonds amorçage</w:t>
-      </w:r>
-    </w:p>
-    <w:p/>
-    <w:tbl>
-      <w:tblPr>
-        <w:tblStyle w:val="TableGrid"/>
-        <w:tblW w:type="auto" w:w="0"/>
-        <w:tblLook w:firstColumn="1" w:firstRow="1" w:lastColumn="0" w:lastRow="0" w:noHBand="0" w:noVBand="1" w:val="04A0"/>
-      </w:tblPr>
-      <w:tblGrid>
-        <w:gridCol w:w="4933"/>
-        <w:gridCol w:w="4933"/>
-      </w:tblGrid>
-      <w:tr>
-        <w:tc>
-          <w:tcPr>
-            <w:tcW w:type="dxa" w:w="6236"/>
-            <w:tcBdr>
-              <w:top w:val="none" w:sz="0" w:space="0" w:color="auto"/>
-            </w:tcBdr>
-            <w:tcBdr>
-              <w:left w:val="none" w:sz="0" w:space="0" w:color="auto"/>
-            </w:tcBdr>
-            <w:tcBdr>
-              <w:bottom w:val="none" w:sz="0" w:space="0" w:color="auto"/>
-            </w:tcBdr>
-            <w:tcBdr>
-              <w:right w:val="none" w:sz="0" w:space="0" w:color="auto"/>
-            </w:tcBdr>
-            <w:tcMar>
-              <w:top w:w="0" w:type="dxa"/>
-              <w:start w:w="0" w:type="dxa"/>
-              <w:bottom w:w="0" w:type="dxa"/>
-              <w:end w:w="100" w:type="dxa"/>
-            </w:tcMar>
-          </w:tcPr>
           <w:p>
             <w:pPr>
-              <w:spacing w:before="0" w:after="0"/>
-              <w:jc w:val="left"/>
+              <w:spacing w:before="20" w:after="0"/>
+              <w:ind w:left="227" w:hanging="170"/>
+            </w:pPr>
+            <w:r>
+              <w:rPr>
+                <w:rFonts w:ascii="Calibri" w:hAnsi="Calibri"/>
+                <w:color w:val="1A8CD8"/>
+                <w:sz w:val="18"/>
+              </w:rPr>
+              <w:t xml:space="preserve">▸  </w:t>
+            </w:r>
+            <w:r>
+              <w:rPr>
+                <w:rFonts w:ascii="Calibri" w:hAnsi="Calibri"/>
+                <w:color w:val="444455"/>
+                <w:sz w:val="18"/>
+              </w:rPr>
+              <w:t>Architecture &amp; développement from scratch : React, Node.js, MongoDB, Cinetpay/Wave</w:t>
+            </w:r>
+          </w:p>
+          <w:p>
+            <w:pPr>
+              <w:spacing w:before="20" w:after="0"/>
+              <w:ind w:left="227" w:hanging="170"/>
+            </w:pPr>
+            <w:r>
+              <w:rPr>
+                <w:rFonts w:ascii="Calibri" w:hAnsi="Calibri"/>
+                <w:color w:val="1A8CD8"/>
+                <w:sz w:val="18"/>
+              </w:rPr>
+              <w:t xml:space="preserve">▸  </w:t>
+            </w:r>
+            <w:r>
+              <w:rPr>
+                <w:rFonts w:ascii="Calibri" w:hAnsi="Calibri"/>
+                <w:color w:val="444455"/>
+                <w:sz w:val="18"/>
+              </w:rPr>
+              <w:t>Gestion produit, roadmap technique, levée de fonds amorçage</w:t>
+            </w:r>
+          </w:p>
+          <w:p/>
+          <w:p>
+            <w:pPr>
+              <w:tabs>
+                <w:tab w:pos="7483" w:val="right"/>
+              </w:tabs>
+              <w:spacing w:before="120" w:after="0"/>
             </w:pPr>
             <w:r>
               <w:rPr>
                 <w:rFonts w:ascii="Calibri" w:hAnsi="Calibri"/>
                 <w:b/>
-                <w:i w:val="0"/>
-                <w:color w:val="163753"/>
+                <w:color w:val="0F2A3F"/>
                 <w:sz w:val="20"/>
               </w:rPr>
-              <w:t>Développeur &amp; Formateur Tech</w:t>
+              <w:t>Stagiaire Audit &amp; Conseils IT</w:t>
+            </w:r>
+            <w:r>
+              <w:rPr>
+                <w:rFonts w:ascii="Calibri" w:hAnsi="Calibri"/>
+                <w:i/>
+                <w:color w:val="9999AA"/>
+                <w:sz w:val="17"/>
+              </w:rPr>
+              <w:tab/>
+              <w:t>2023 – 2024</w:t>
             </w:r>
           </w:p>
           <w:p>
             <w:pPr>
-              <w:spacing w:before="0" w:after="20"/>
+              <w:spacing w:before="0" w:after="40"/>
             </w:pPr>
             <w:r>
               <w:rPr>
                 <w:rFonts w:ascii="Calibri" w:hAnsi="Calibri"/>
-                <w:b w:val="0"/>
                 <w:i/>
-                <w:color w:val="0078D4"/>
-                <w:sz w:val="19"/>
-              </w:rPr>
-              <w:t>Éducation Pour Tous CI</w:t>
-            </w:r>
-            <w:r>
-              <w:rPr>
-                <w:rFonts w:ascii="Calibri" w:hAnsi="Calibri"/>
-                <w:b w:val="0"/>
-                <w:i w:val="0"/>
-                <w:color w:val="AAAAAA"/>
-                <w:sz w:val="18"/>
-              </w:rPr>
-              <w:t xml:space="preserve">  ·  Côte d'Ivoire</w:t>
-            </w:r>
-          </w:p>
-        </w:tc>
-        <w:tc>
-          <w:tcPr>
-            <w:tcW w:type="dxa" w:w="3402"/>
-            <w:tcBdr>
-              <w:top w:val="none" w:sz="0" w:space="0" w:color="auto"/>
-            </w:tcBdr>
-            <w:tcBdr>
-              <w:left w:val="none" w:sz="0" w:space="0" w:color="auto"/>
-            </w:tcBdr>
-            <w:tcBdr>
-              <w:bottom w:val="none" w:sz="0" w:space="0" w:color="auto"/>
-            </w:tcBdr>
-            <w:tcBdr>
-              <w:right w:val="none" w:sz="0" w:space="0" w:color="auto"/>
-            </w:tcBdr>
-            <w:tcMar>
-              <w:top w:w="0" w:type="dxa"/>
-              <w:start w:w="0" w:type="dxa"/>
-              <w:bottom w:w="0" w:type="dxa"/>
-              <w:end w:w="0" w:type="dxa"/>
-            </w:tcMar>
-          </w:tcPr>
-          <w:p>
-            <w:pPr>
-              <w:spacing w:before="0" w:after="0"/>
-              <w:jc w:val="right"/>
-            </w:pPr>
-            <w:r>
-              <w:rPr>
-                <w:rFonts w:ascii="Calibri" w:hAnsi="Calibri"/>
-                <w:b w:val="0"/>
-                <w:i/>
-                <w:color w:val="AAAAAA"/>
-                <w:sz w:val="18"/>
-              </w:rPr>
-              <w:t>2023</w:t>
-            </w:r>
-          </w:p>
-        </w:tc>
-      </w:tr>
-    </w:tbl>
-    <w:p>
-      <w:pPr>
-        <w:spacing w:before="20" w:after="0"/>
-        <w:ind w:left="283" w:hanging="170"/>
-      </w:pPr>
-      <w:r>
-        <w:rPr>
-          <w:rFonts w:ascii="Calibri" w:hAnsi="Calibri"/>
-          <w:b w:val="0"/>
-          <w:i w:val="0"/>
-          <w:color w:val="0078D4"/>
-          <w:sz w:val="18"/>
-        </w:rPr>
-        <w:t xml:space="preserve">▸  </w:t>
-      </w:r>
-      <w:r>
-        <w:rPr>
-          <w:rFonts w:ascii="Calibri" w:hAnsi="Calibri"/>
-          <w:b w:val="0"/>
-          <w:i w:val="0"/>
-          <w:color w:val="555555"/>
-          <w:sz w:val="19"/>
-        </w:rPr>
-        <w:t>Développement d'une plateforme e-learning pour l'enseignement en zones rurales</w:t>
-      </w:r>
-    </w:p>
-    <w:p>
-      <w:pPr>
-        <w:spacing w:before="20" w:after="0"/>
-        <w:ind w:left="283" w:hanging="170"/>
-      </w:pPr>
-      <w:r>
-        <w:rPr>
-          <w:rFonts w:ascii="Calibri" w:hAnsi="Calibri"/>
-          <w:b w:val="0"/>
-          <w:i w:val="0"/>
-          <w:color w:val="0078D4"/>
-          <w:sz w:val="18"/>
-        </w:rPr>
-        <w:t xml:space="preserve">▸  </w:t>
-      </w:r>
-      <w:r>
-        <w:rPr>
-          <w:rFonts w:ascii="Calibri" w:hAnsi="Calibri"/>
-          <w:b w:val="0"/>
-          <w:i w:val="0"/>
-          <w:color w:val="555555"/>
-          <w:sz w:val="19"/>
-        </w:rPr>
-        <w:t>Animation de formations en programmation et culture numérique pour 100+ apprenants</w:t>
-      </w:r>
-    </w:p>
-    <w:p/>
-    <w:tbl>
-      <w:tblPr>
-        <w:tblStyle w:val="TableGrid"/>
-        <w:tblW w:type="auto" w:w="0"/>
-        <w:tblLook w:firstColumn="1" w:firstRow="1" w:lastColumn="0" w:lastRow="0" w:noHBand="0" w:noVBand="1" w:val="04A0"/>
-      </w:tblPr>
-      <w:tblGrid>
-        <w:gridCol w:w="4933"/>
-        <w:gridCol w:w="4933"/>
-      </w:tblGrid>
-      <w:tr>
-        <w:tc>
-          <w:tcPr>
-            <w:tcW w:type="dxa" w:w="6236"/>
-            <w:tcBdr>
-              <w:top w:val="none" w:sz="0" w:space="0" w:color="auto"/>
-            </w:tcBdr>
-            <w:tcBdr>
-              <w:left w:val="none" w:sz="0" w:space="0" w:color="auto"/>
-            </w:tcBdr>
-            <w:tcBdr>
-              <w:bottom w:val="none" w:sz="0" w:space="0" w:color="auto"/>
-            </w:tcBdr>
-            <w:tcBdr>
-              <w:right w:val="none" w:sz="0" w:space="0" w:color="auto"/>
-            </w:tcBdr>
-            <w:tcMar>
-              <w:top w:w="0" w:type="dxa"/>
-              <w:start w:w="0" w:type="dxa"/>
-              <w:bottom w:w="0" w:type="dxa"/>
-              <w:end w:w="100" w:type="dxa"/>
-            </w:tcMar>
-          </w:tcPr>
-          <w:p>
-            <w:pPr>
-              <w:spacing w:before="0" w:after="0"/>
-              <w:jc w:val="left"/>
-            </w:pPr>
-            <w:r>
-              <w:rPr>
-                <w:rFonts w:ascii="Calibri" w:hAnsi="Calibri"/>
-                <w:b/>
-                <w:i w:val="0"/>
-                <w:color w:val="163753"/>
-                <w:sz w:val="20"/>
-              </w:rPr>
-              <w:t>Stagiaire Audit &amp; Conseils IT</w:t>
-            </w:r>
-          </w:p>
-          <w:p>
-            <w:pPr>
-              <w:spacing w:before="0" w:after="20"/>
-            </w:pPr>
-            <w:r>
-              <w:rPr>
-                <w:rFonts w:ascii="Calibri" w:hAnsi="Calibri"/>
-                <w:b w:val="0"/>
-                <w:i/>
-                <w:color w:val="0078D4"/>
+                <w:color w:val="1A8CD8"/>
                 <w:sz w:val="19"/>
               </w:rPr>
               <w:t>Y3 Audit &amp; Conseils</w:t>
@@ -1185,1346 +1413,593 @@
             <w:r>
               <w:rPr>
                 <w:rFonts w:ascii="Calibri" w:hAnsi="Calibri"/>
-                <w:b w:val="0"/>
-                <w:i w:val="0"/>
-                <w:color w:val="AAAAAA"/>
-                <w:sz w:val="18"/>
+                <w:color w:val="9999AA"/>
+                <w:sz w:val="17"/>
               </w:rPr>
               <w:t xml:space="preserve">  ·  Abidjan, CI</w:t>
             </w:r>
           </w:p>
-        </w:tc>
-        <w:tc>
-          <w:tcPr>
-            <w:tcW w:type="dxa" w:w="3402"/>
-            <w:tcBdr>
-              <w:top w:val="none" w:sz="0" w:space="0" w:color="auto"/>
-            </w:tcBdr>
-            <w:tcBdr>
-              <w:left w:val="none" w:sz="0" w:space="0" w:color="auto"/>
-            </w:tcBdr>
-            <w:tcBdr>
-              <w:bottom w:val="none" w:sz="0" w:space="0" w:color="auto"/>
-            </w:tcBdr>
-            <w:tcBdr>
-              <w:right w:val="none" w:sz="0" w:space="0" w:color="auto"/>
-            </w:tcBdr>
-            <w:tcMar>
-              <w:top w:w="0" w:type="dxa"/>
-              <w:start w:w="0" w:type="dxa"/>
-              <w:bottom w:w="0" w:type="dxa"/>
-              <w:end w:w="0" w:type="dxa"/>
-            </w:tcMar>
-          </w:tcPr>
           <w:p>
             <w:pPr>
-              <w:spacing w:before="0" w:after="0"/>
-              <w:jc w:val="right"/>
+              <w:spacing w:before="20" w:after="0"/>
+              <w:ind w:left="227" w:hanging="170"/>
             </w:pPr>
             <w:r>
               <w:rPr>
                 <w:rFonts w:ascii="Calibri" w:hAnsi="Calibri"/>
-                <w:b w:val="0"/>
-                <w:i/>
-                <w:color w:val="AAAAAA"/>
+                <w:color w:val="1A8CD8"/>
                 <w:sz w:val="18"/>
               </w:rPr>
-              <w:t>2023 – 2024</w:t>
+              <w:t xml:space="preserve">▸  </w:t>
+            </w:r>
+            <w:r>
+              <w:rPr>
+                <w:rFonts w:ascii="Calibri" w:hAnsi="Calibri"/>
+                <w:color w:val="444455"/>
+                <w:sz w:val="18"/>
+              </w:rPr>
+              <w:t>Audit des systèmes d'information, livrables de conformité</w:t>
             </w:r>
           </w:p>
-        </w:tc>
-      </w:tr>
-    </w:tbl>
-    <w:p>
-      <w:pPr>
-        <w:spacing w:before="20" w:after="0"/>
-        <w:ind w:left="283" w:hanging="170"/>
-      </w:pPr>
-      <w:r>
-        <w:rPr>
-          <w:rFonts w:ascii="Calibri" w:hAnsi="Calibri"/>
-          <w:b w:val="0"/>
-          <w:i w:val="0"/>
-          <w:color w:val="0078D4"/>
-          <w:sz w:val="18"/>
-        </w:rPr>
-        <w:t xml:space="preserve">▸  </w:t>
-      </w:r>
-      <w:r>
-        <w:rPr>
-          <w:rFonts w:ascii="Calibri" w:hAnsi="Calibri"/>
-          <w:b w:val="0"/>
-          <w:i w:val="0"/>
-          <w:color w:val="555555"/>
-          <w:sz w:val="19"/>
-        </w:rPr>
-        <w:t>Audit des systèmes d'information et rédaction de livrables de conformité</w:t>
-      </w:r>
-    </w:p>
-    <w:p>
-      <w:pPr>
-        <w:spacing w:before="20" w:after="0"/>
-        <w:ind w:left="283" w:hanging="170"/>
-      </w:pPr>
-      <w:r>
-        <w:rPr>
-          <w:rFonts w:ascii="Calibri" w:hAnsi="Calibri"/>
-          <w:b w:val="0"/>
-          <w:i w:val="0"/>
-          <w:color w:val="0078D4"/>
-          <w:sz w:val="18"/>
-        </w:rPr>
-        <w:t xml:space="preserve">▸  </w:t>
-      </w:r>
-      <w:r>
-        <w:rPr>
-          <w:rFonts w:ascii="Calibri" w:hAnsi="Calibri"/>
-          <w:b w:val="0"/>
-          <w:i w:val="0"/>
-          <w:color w:val="555555"/>
-          <w:sz w:val="19"/>
-        </w:rPr>
-        <w:t>Support à la mise en œuvre de politiques de sécurité informatique (ISO 27001)</w:t>
-      </w:r>
-    </w:p>
-    <w:p/>
-    <w:p>
-      <w:pPr>
-        <w:spacing w:before="200" w:after="40"/>
-        <w:jc w:val="left"/>
-      </w:pPr>
-      <w:r>
-        <w:rPr>
-          <w:rFonts w:ascii="Calibri" w:hAnsi="Calibri"/>
-          <w:b/>
-          <w:i w:val="0"/>
-          <w:caps/>
-          <w:color w:val="163753"/>
-          <w:sz w:val="22"/>
-        </w:rPr>
-        <w:t>FORMATION</w:t>
-      </w:r>
-    </w:p>
-    <w:p>
-      <w:pPr>
-        <w:spacing w:before="40" w:after="40"/>
-        <w:pBdr>
-          <w:bottom w:val="single" w:sz="6" w:space="1" w:color="163753"/>
-        </w:pBdr>
-      </w:pPr>
-    </w:p>
-    <w:p>
-      <w:pPr>
-        <w:spacing w:before="60" w:after="0"/>
-        <w:jc w:val="left"/>
-      </w:pPr>
-      <w:r>
-        <w:rPr>
-          <w:rFonts w:ascii="Calibri" w:hAnsi="Calibri"/>
-          <w:b/>
-          <w:i w:val="0"/>
-          <w:color w:val="163753"/>
-          <w:sz w:val="20"/>
-        </w:rPr>
-        <w:t>Master Électronique, Électrotechnique, Automatique &amp; Informatique (EEAI)</w:t>
-      </w:r>
-      <w:r>
-        <w:rPr>
-          <w:rFonts w:ascii="Calibri" w:hAnsi="Calibri"/>
-          <w:b w:val="0"/>
-          <w:i/>
-          <w:color w:val="0078D4"/>
-          <w:sz w:val="19"/>
-        </w:rPr>
-        <w:t xml:space="preserve">  —  Mention Bien</w:t>
-      </w:r>
-    </w:p>
-    <w:p>
-      <w:pPr>
-        <w:spacing w:before="0" w:after="40"/>
-        <w:jc w:val="left"/>
-      </w:pPr>
-      <w:r>
-        <w:rPr>
-          <w:rFonts w:ascii="Calibri" w:hAnsi="Calibri"/>
-          <w:b w:val="0"/>
-          <w:i w:val="0"/>
-          <w:color w:val="555555"/>
-          <w:sz w:val="19"/>
-        </w:rPr>
-        <w:t>Université Félix Houphouët-Boigny (UFR-SSMT), Abidjan</w:t>
-      </w:r>
-      <w:r>
-        <w:rPr>
-          <w:rFonts w:ascii="Calibri" w:hAnsi="Calibri"/>
-          <w:b w:val="0"/>
-          <w:i/>
-          <w:color w:val="AAAAAA"/>
-          <w:sz w:val="18"/>
-        </w:rPr>
-        <w:t xml:space="preserve">  ·  2024</w:t>
-      </w:r>
-    </w:p>
-    <w:p>
-      <w:pPr>
-        <w:spacing w:before="60" w:after="0"/>
-        <w:jc w:val="left"/>
-      </w:pPr>
-      <w:r>
-        <w:rPr>
-          <w:rFonts w:ascii="Calibri" w:hAnsi="Calibri"/>
-          <w:b/>
-          <w:i w:val="0"/>
-          <w:color w:val="163753"/>
-          <w:sz w:val="20"/>
-        </w:rPr>
-        <w:t>Licence Électronique, Électrotechnique, Automatique &amp; Informatique (EEAI)</w:t>
-      </w:r>
-    </w:p>
-    <w:p>
-      <w:pPr>
-        <w:spacing w:before="0" w:after="40"/>
-        <w:jc w:val="left"/>
-      </w:pPr>
-      <w:r>
-        <w:rPr>
-          <w:rFonts w:ascii="Calibri" w:hAnsi="Calibri"/>
-          <w:b w:val="0"/>
-          <w:i w:val="0"/>
-          <w:color w:val="555555"/>
-          <w:sz w:val="19"/>
-        </w:rPr>
-        <w:t>Université Félix Houphouët-Boigny (UFR-SSMT), Abidjan</w:t>
-      </w:r>
-      <w:r>
-        <w:rPr>
-          <w:rFonts w:ascii="Calibri" w:hAnsi="Calibri"/>
-          <w:b w:val="0"/>
-          <w:i/>
-          <w:color w:val="AAAAAA"/>
-          <w:sz w:val="18"/>
-        </w:rPr>
-        <w:t xml:space="preserve">  ·  2022</w:t>
-      </w:r>
-    </w:p>
-    <w:p>
-      <w:pPr>
-        <w:spacing w:before="40" w:after="80"/>
-        <w:ind w:left="227"/>
-        <w:jc w:val="left"/>
-      </w:pPr>
-      <w:r>
-        <w:rPr>
-          <w:rFonts w:ascii="Calibri" w:hAnsi="Calibri"/>
-          <w:b/>
-          <w:i w:val="0"/>
-          <w:color w:val="163753"/>
-          <w:sz w:val="19"/>
-        </w:rPr>
-        <w:t xml:space="preserve">📄 Mémoire : </w:t>
-      </w:r>
-      <w:r>
-        <w:rPr>
-          <w:rFonts w:ascii="Calibri" w:hAnsi="Calibri"/>
-          <w:b w:val="0"/>
-          <w:i/>
-          <w:color w:val="555555"/>
-          <w:sz w:val="19"/>
-        </w:rPr>
-        <w:t>"Conception et développement d'un système de monitoring et de télégestion d'infrastructures photovoltaïques" — Jury félicitations</w:t>
-      </w:r>
-    </w:p>
-    <w:p>
-      <w:pPr>
-        <w:spacing w:before="200" w:after="40"/>
-        <w:jc w:val="left"/>
-      </w:pPr>
-      <w:r>
-        <w:rPr>
-          <w:rFonts w:ascii="Calibri" w:hAnsi="Calibri"/>
-          <w:b/>
-          <w:i w:val="0"/>
-          <w:caps/>
-          <w:color w:val="163753"/>
-          <w:sz w:val="22"/>
-        </w:rPr>
-        <w:t>COMPÉTENCES TECHNIQUES</w:t>
-      </w:r>
-    </w:p>
-    <w:p>
-      <w:pPr>
-        <w:spacing w:before="40" w:after="40"/>
-        <w:pBdr>
-          <w:bottom w:val="single" w:sz="6" w:space="1" w:color="163753"/>
-        </w:pBdr>
-      </w:pPr>
-    </w:p>
-    <w:p>
-      <w:pPr>
-        <w:spacing w:before="40" w:after="20"/>
-        <w:ind w:left="170"/>
-        <w:jc w:val="left"/>
-      </w:pPr>
-      <w:r>
-        <w:rPr>
-          <w:rFonts w:ascii="Calibri" w:hAnsi="Calibri"/>
-          <w:b/>
-          <w:i w:val="0"/>
-          <w:color w:val="163753"/>
-          <w:sz w:val="19"/>
-        </w:rPr>
-        <w:t xml:space="preserve">Langages &amp; Frameworks : </w:t>
-      </w:r>
-      <w:r>
-        <w:rPr>
-          <w:rFonts w:ascii="Calibri" w:hAnsi="Calibri"/>
-          <w:b w:val="0"/>
-          <w:i w:val="0"/>
-          <w:color w:val="555555"/>
-          <w:sz w:val="19"/>
-        </w:rPr>
-        <w:t>JavaScript (React, Node.js) · PHP (Laravel) · Python · Flutter · React Native · Dart</w:t>
-      </w:r>
-    </w:p>
-    <w:p>
-      <w:pPr>
-        <w:spacing w:before="40" w:after="20"/>
-        <w:ind w:left="170"/>
-        <w:jc w:val="left"/>
-      </w:pPr>
-      <w:r>
-        <w:rPr>
-          <w:rFonts w:ascii="Calibri" w:hAnsi="Calibri"/>
-          <w:b/>
-          <w:i w:val="0"/>
-          <w:color w:val="163753"/>
-          <w:sz w:val="19"/>
-        </w:rPr>
-        <w:t xml:space="preserve">Bases de données : </w:t>
-      </w:r>
-      <w:r>
-        <w:rPr>
-          <w:rFonts w:ascii="Calibri" w:hAnsi="Calibri"/>
-          <w:b w:val="0"/>
-          <w:i w:val="0"/>
-          <w:color w:val="555555"/>
-          <w:sz w:val="19"/>
-        </w:rPr>
-        <w:t>MySQL · PostgreSQL · MongoDB · Firebase Firestore · Redis</w:t>
-      </w:r>
-    </w:p>
-    <w:p>
-      <w:pPr>
-        <w:spacing w:before="40" w:after="20"/>
-        <w:ind w:left="170"/>
-        <w:jc w:val="left"/>
-      </w:pPr>
-      <w:r>
-        <w:rPr>
-          <w:rFonts w:ascii="Calibri" w:hAnsi="Calibri"/>
-          <w:b/>
-          <w:i w:val="0"/>
-          <w:color w:val="163753"/>
-          <w:sz w:val="19"/>
-        </w:rPr>
-        <w:t xml:space="preserve">Cloud &amp; DevOps : </w:t>
-      </w:r>
-      <w:r>
-        <w:rPr>
-          <w:rFonts w:ascii="Calibri" w:hAnsi="Calibri"/>
-          <w:b w:val="0"/>
-          <w:i w:val="0"/>
-          <w:color w:val="555555"/>
-          <w:sz w:val="19"/>
-        </w:rPr>
-        <w:t>Google Cloud Platform (GCP) · AWS · Azure · Docker · GitHub Actions · CI/CD</w:t>
-      </w:r>
-    </w:p>
-    <w:p>
-      <w:pPr>
-        <w:spacing w:before="40" w:after="20"/>
-        <w:ind w:left="170"/>
-        <w:jc w:val="left"/>
-      </w:pPr>
-      <w:r>
-        <w:rPr>
-          <w:rFonts w:ascii="Calibri" w:hAnsi="Calibri"/>
-          <w:b/>
-          <w:i w:val="0"/>
-          <w:color w:val="163753"/>
-          <w:sz w:val="19"/>
-        </w:rPr>
-        <w:t xml:space="preserve">Outils de gestion : </w:t>
-      </w:r>
-      <w:r>
-        <w:rPr>
-          <w:rFonts w:ascii="Calibri" w:hAnsi="Calibri"/>
-          <w:b w:val="0"/>
-          <w:i w:val="0"/>
-          <w:color w:val="555555"/>
-          <w:sz w:val="19"/>
-        </w:rPr>
-        <w:t>MS Project · Jira · Notion · Microsoft 365 · Teams · Power BI</w:t>
-      </w:r>
-    </w:p>
-    <w:p>
-      <w:pPr>
-        <w:spacing w:before="40" w:after="20"/>
-        <w:ind w:left="170"/>
-        <w:jc w:val="left"/>
-      </w:pPr>
-      <w:r>
-        <w:rPr>
-          <w:rFonts w:ascii="Calibri" w:hAnsi="Calibri"/>
-          <w:b/>
-          <w:i w:val="0"/>
-          <w:color w:val="163753"/>
-          <w:sz w:val="19"/>
-        </w:rPr>
-        <w:t xml:space="preserve">Systèmes &amp; Réseaux : </w:t>
-      </w:r>
-      <w:r>
-        <w:rPr>
-          <w:rFonts w:ascii="Calibri" w:hAnsi="Calibri"/>
-          <w:b w:val="0"/>
-          <w:i w:val="0"/>
-          <w:color w:val="555555"/>
-          <w:sz w:val="19"/>
-        </w:rPr>
-        <w:t>Linux (Ubuntu/Debian) · Windows Server · Cisco · TIA Portal (automates Siemens)</w:t>
-      </w:r>
-    </w:p>
-    <w:p>
-      <w:pPr>
-        <w:spacing w:before="40" w:after="20"/>
-        <w:ind w:left="170"/>
-        <w:jc w:val="left"/>
-      </w:pPr>
-      <w:r>
-        <w:rPr>
-          <w:rFonts w:ascii="Calibri" w:hAnsi="Calibri"/>
-          <w:b/>
-          <w:i w:val="0"/>
-          <w:color w:val="163753"/>
-          <w:sz w:val="19"/>
-        </w:rPr>
-        <w:t xml:space="preserve">IoT &amp; Embarqué : </w:t>
-      </w:r>
-      <w:r>
-        <w:rPr>
-          <w:rFonts w:ascii="Calibri" w:hAnsi="Calibri"/>
-          <w:b w:val="0"/>
-          <w:i w:val="0"/>
-          <w:color w:val="555555"/>
-          <w:sz w:val="19"/>
-        </w:rPr>
-        <w:t>Arduino · Raspberry Pi · Protocoles MQTT/Modbus</w:t>
-      </w:r>
-    </w:p>
-    <w:p>
-      <w:pPr>
-        <w:spacing w:before="40" w:after="20"/>
-        <w:ind w:left="170"/>
-        <w:jc w:val="left"/>
-      </w:pPr>
-      <w:r>
-        <w:rPr>
-          <w:rFonts w:ascii="Calibri" w:hAnsi="Calibri"/>
-          <w:b/>
-          <w:i w:val="0"/>
-          <w:color w:val="163753"/>
-          <w:sz w:val="19"/>
-        </w:rPr>
-        <w:t xml:space="preserve">Sécurité : </w:t>
-      </w:r>
-      <w:r>
-        <w:rPr>
-          <w:rFonts w:ascii="Calibri" w:hAnsi="Calibri"/>
-          <w:b w:val="0"/>
-          <w:i w:val="0"/>
-          <w:color w:val="555555"/>
-          <w:sz w:val="19"/>
-        </w:rPr>
-        <w:t>ISO 27001 · OWASP · Gestion des accès et identités (IAM)</w:t>
-      </w:r>
-    </w:p>
-    <w:p>
-      <w:pPr>
-        <w:spacing w:before="200" w:after="40"/>
-        <w:jc w:val="left"/>
-      </w:pPr>
-      <w:r>
-        <w:rPr>
-          <w:rFonts w:ascii="Calibri" w:hAnsi="Calibri"/>
-          <w:b/>
-          <w:i w:val="0"/>
-          <w:caps/>
-          <w:color w:val="163753"/>
-          <w:sz w:val="22"/>
-        </w:rPr>
-        <w:t>EXPERTISE MÉTIER &amp; MANAGEMENT</w:t>
-      </w:r>
-    </w:p>
-    <w:p>
-      <w:pPr>
-        <w:spacing w:before="40" w:after="40"/>
-        <w:pBdr>
-          <w:bottom w:val="single" w:sz="6" w:space="1" w:color="163753"/>
-        </w:pBdr>
-      </w:pPr>
-    </w:p>
-    <w:tbl>
-      <w:tblPr>
-        <w:tblStyle w:val="TableGrid"/>
-        <w:tblW w:type="auto" w:w="0"/>
-        <w:tblLook w:firstColumn="1" w:firstRow="1" w:lastColumn="0" w:lastRow="0" w:noHBand="0" w:noVBand="1" w:val="04A0"/>
-      </w:tblPr>
-      <w:tblGrid>
-        <w:gridCol w:w="4933"/>
-        <w:gridCol w:w="4933"/>
-      </w:tblGrid>
-      <w:tr>
-        <w:tc>
-          <w:tcPr>
-            <w:tcW w:type="dxa" w:w="4933"/>
-            <w:tcBdr>
-              <w:top w:val="none" w:sz="0" w:space="0" w:color="auto"/>
-              <w:left w:val="none" w:sz="0" w:space="0" w:color="auto"/>
-              <w:bottom w:val="none" w:sz="0" w:space="0" w:color="auto"/>
-              <w:right w:val="none" w:sz="0" w:space="0" w:color="auto"/>
-              <w:insideH w:val="none" w:sz="0" w:space="0" w:color="auto"/>
-              <w:insideV w:val="none" w:sz="0" w:space="0" w:color="auto"/>
-            </w:tcBdr>
-          </w:tcPr>
           <w:p>
             <w:pPr>
-              <w:spacing w:before="40" w:after="40"/>
+              <w:spacing w:before="20" w:after="0"/>
+              <w:ind w:left="227" w:hanging="170"/>
             </w:pPr>
             <w:r>
               <w:rPr>
                 <w:rFonts w:ascii="Calibri" w:hAnsi="Calibri"/>
-                <w:b w:val="0"/>
-                <w:i w:val="0"/>
-                <w:color w:val="0078D4"/>
-                <w:sz w:val="19"/>
+                <w:color w:val="1A8CD8"/>
+                <w:sz w:val="18"/>
               </w:rPr>
-              <w:t xml:space="preserve">✔  </w:t>
+              <w:t xml:space="preserve">▸  </w:t>
             </w:r>
             <w:r>
               <w:rPr>
                 <w:rFonts w:ascii="Calibri" w:hAnsi="Calibri"/>
-                <w:b w:val="0"/>
-                <w:i w:val="0"/>
-                <w:color w:val="1A1A2E"/>
-                <w:sz w:val="19"/>
+                <w:color w:val="444455"/>
+                <w:sz w:val="18"/>
               </w:rPr>
-              <w:t>Manager Projets IT / PMO</w:t>
+              <w:t>Support à la mise en œuvre de politiques de sécurité (ISO 27001)</w:t>
             </w:r>
           </w:p>
-        </w:tc>
-        <w:tc>
-          <w:tcPr>
-            <w:tcW w:type="dxa" w:w="4933"/>
-            <w:tcBdr>
-              <w:top w:val="none" w:sz="0" w:space="0" w:color="auto"/>
-              <w:left w:val="none" w:sz="0" w:space="0" w:color="auto"/>
-              <w:bottom w:val="none" w:sz="0" w:space="0" w:color="auto"/>
-              <w:right w:val="none" w:sz="0" w:space="0" w:color="auto"/>
-              <w:insideH w:val="none" w:sz="0" w:space="0" w:color="auto"/>
-              <w:insideV w:val="none" w:sz="0" w:space="0" w:color="auto"/>
-            </w:tcBdr>
-          </w:tcPr>
+          <w:p/>
           <w:p>
             <w:pPr>
-              <w:spacing w:before="40" w:after="40"/>
+              <w:spacing w:before="240" w:after="60"/>
+              <w:pBdr>
+                <w:bottom w:val="single" w:sz="6" w:space="2" w:color="0F2A3F"/>
+              </w:pBdr>
             </w:pPr>
             <w:r>
               <w:rPr>
-                <w:rFonts w:ascii="Calibri" w:hAnsi="Calibri"/>
-                <w:b w:val="0"/>
-                <w:i w:val="0"/>
-                <w:color w:val="0078D4"/>
-                <w:sz w:val="19"/>
+                <w:sz w:val="22"/>
               </w:rPr>
-              <w:t xml:space="preserve">✔  </w:t>
+              <w:t xml:space="preserve">🎓  </w:t>
             </w:r>
             <w:r>
               <w:rPr>
                 <w:rFonts w:ascii="Calibri" w:hAnsi="Calibri"/>
-                <w:b w:val="0"/>
-                <w:i w:val="0"/>
-                <w:color w:val="1A1A2E"/>
-                <w:sz w:val="19"/>
+                <w:b/>
+                <w:caps/>
+                <w:color w:val="0F2A3F"/>
+                <w:sz w:val="21"/>
               </w:rPr>
-              <w:t>Directeur des Systèmes d'Information (DSI)</w:t>
+              <w:t>FORMATION</w:t>
             </w:r>
           </w:p>
-        </w:tc>
-      </w:tr>
-      <w:tr>
-        <w:tc>
-          <w:tcPr>
-            <w:tcW w:type="dxa" w:w="4933"/>
-            <w:tcBdr>
-              <w:top w:val="none" w:sz="0" w:space="0" w:color="auto"/>
-              <w:left w:val="none" w:sz="0" w:space="0" w:color="auto"/>
-              <w:bottom w:val="none" w:sz="0" w:space="0" w:color="auto"/>
-              <w:right w:val="none" w:sz="0" w:space="0" w:color="auto"/>
-              <w:insideH w:val="none" w:sz="0" w:space="0" w:color="auto"/>
-              <w:insideV w:val="none" w:sz="0" w:space="0" w:color="auto"/>
-            </w:tcBdr>
-          </w:tcPr>
           <w:p>
             <w:pPr>
-              <w:spacing w:before="40" w:after="40"/>
-            </w:pPr>
-            <w:r>
-              <w:rPr>
-                <w:rFonts w:ascii="Calibri" w:hAnsi="Calibri"/>
-                <w:b w:val="0"/>
-                <w:i w:val="0"/>
-                <w:color w:val="0078D4"/>
-                <w:sz w:val="19"/>
-              </w:rPr>
-              <w:t xml:space="preserve">✔  </w:t>
-            </w:r>
-            <w:r>
-              <w:rPr>
-                <w:rFonts w:ascii="Calibri" w:hAnsi="Calibri"/>
-                <w:b w:val="0"/>
-                <w:i w:val="0"/>
-                <w:color w:val="1A1A2E"/>
-                <w:sz w:val="19"/>
-              </w:rPr>
-              <w:t>Responsable Infrastructure &amp; Support IT</w:t>
-            </w:r>
-          </w:p>
-        </w:tc>
-        <w:tc>
-          <w:tcPr>
-            <w:tcW w:type="dxa" w:w="4933"/>
-            <w:tcBdr>
-              <w:top w:val="none" w:sz="0" w:space="0" w:color="auto"/>
-              <w:left w:val="none" w:sz="0" w:space="0" w:color="auto"/>
-              <w:bottom w:val="none" w:sz="0" w:space="0" w:color="auto"/>
-              <w:right w:val="none" w:sz="0" w:space="0" w:color="auto"/>
-              <w:insideH w:val="none" w:sz="0" w:space="0" w:color="auto"/>
-              <w:insideV w:val="none" w:sz="0" w:space="0" w:color="auto"/>
-            </w:tcBdr>
-          </w:tcPr>
-          <w:p>
-            <w:pPr>
-              <w:spacing w:before="40" w:after="40"/>
-            </w:pPr>
-            <w:r>
-              <w:rPr>
-                <w:rFonts w:ascii="Calibri" w:hAnsi="Calibri"/>
-                <w:b w:val="0"/>
-                <w:i w:val="0"/>
-                <w:color w:val="0078D4"/>
-                <w:sz w:val="19"/>
-              </w:rPr>
-              <w:t xml:space="preserve">✔  </w:t>
-            </w:r>
-            <w:r>
-              <w:rPr>
-                <w:rFonts w:ascii="Calibri" w:hAnsi="Calibri"/>
-                <w:b w:val="0"/>
-                <w:i w:val="0"/>
-                <w:color w:val="1A1A2E"/>
-                <w:sz w:val="19"/>
-              </w:rPr>
-              <w:t>Responsable Développement &amp; Intégration</w:t>
-            </w:r>
-          </w:p>
-        </w:tc>
-      </w:tr>
-      <w:tr>
-        <w:tc>
-          <w:tcPr>
-            <w:tcW w:type="dxa" w:w="4933"/>
-            <w:tcBdr>
-              <w:top w:val="none" w:sz="0" w:space="0" w:color="auto"/>
-              <w:left w:val="none" w:sz="0" w:space="0" w:color="auto"/>
-              <w:bottom w:val="none" w:sz="0" w:space="0" w:color="auto"/>
-              <w:right w:val="none" w:sz="0" w:space="0" w:color="auto"/>
-              <w:insideH w:val="none" w:sz="0" w:space="0" w:color="auto"/>
-              <w:insideV w:val="none" w:sz="0" w:space="0" w:color="auto"/>
-            </w:tcBdr>
-          </w:tcPr>
-          <w:p>
-            <w:pPr>
-              <w:spacing w:before="40" w:after="40"/>
-            </w:pPr>
-            <w:r>
-              <w:rPr>
-                <w:rFonts w:ascii="Calibri" w:hAnsi="Calibri"/>
-                <w:b w:val="0"/>
-                <w:i w:val="0"/>
-                <w:color w:val="0078D4"/>
-                <w:sz w:val="19"/>
-              </w:rPr>
-              <w:t xml:space="preserve">✔  </w:t>
-            </w:r>
-            <w:r>
-              <w:rPr>
-                <w:rFonts w:ascii="Calibri" w:hAnsi="Calibri"/>
-                <w:b w:val="0"/>
-                <w:i w:val="0"/>
-                <w:color w:val="1A1A2E"/>
-                <w:sz w:val="19"/>
-              </w:rPr>
-              <w:t>Pilotage d'applications métier &amp; ERP</w:t>
-            </w:r>
-          </w:p>
-        </w:tc>
-        <w:tc>
-          <w:tcPr>
-            <w:tcW w:type="dxa" w:w="4933"/>
-            <w:tcBdr>
-              <w:top w:val="none" w:sz="0" w:space="0" w:color="auto"/>
-              <w:left w:val="none" w:sz="0" w:space="0" w:color="auto"/>
-              <w:bottom w:val="none" w:sz="0" w:space="0" w:color="auto"/>
-              <w:right w:val="none" w:sz="0" w:space="0" w:color="auto"/>
-              <w:insideH w:val="none" w:sz="0" w:space="0" w:color="auto"/>
-              <w:insideV w:val="none" w:sz="0" w:space="0" w:color="auto"/>
-            </w:tcBdr>
-          </w:tcPr>
-          <w:p>
-            <w:pPr>
-              <w:spacing w:before="40" w:after="40"/>
-            </w:pPr>
-            <w:r>
-              <w:rPr>
-                <w:rFonts w:ascii="Calibri" w:hAnsi="Calibri"/>
-                <w:b w:val="0"/>
-                <w:i w:val="0"/>
-                <w:color w:val="0078D4"/>
-                <w:sz w:val="19"/>
-              </w:rPr>
-              <w:t xml:space="preserve">✔  </w:t>
-            </w:r>
-            <w:r>
-              <w:rPr>
-                <w:rFonts w:ascii="Calibri" w:hAnsi="Calibri"/>
-                <w:b w:val="0"/>
-                <w:i w:val="0"/>
-                <w:color w:val="1A1A2E"/>
-                <w:sz w:val="19"/>
-              </w:rPr>
-              <w:t>Planification &amp; Gestion des ressources IT</w:t>
-            </w:r>
-          </w:p>
-        </w:tc>
-      </w:tr>
-      <w:tr>
-        <w:tc>
-          <w:tcPr>
-            <w:tcW w:type="dxa" w:w="4933"/>
-            <w:tcBdr>
-              <w:top w:val="none" w:sz="0" w:space="0" w:color="auto"/>
-              <w:left w:val="none" w:sz="0" w:space="0" w:color="auto"/>
-              <w:bottom w:val="none" w:sz="0" w:space="0" w:color="auto"/>
-              <w:right w:val="none" w:sz="0" w:space="0" w:color="auto"/>
-              <w:insideH w:val="none" w:sz="0" w:space="0" w:color="auto"/>
-              <w:insideV w:val="none" w:sz="0" w:space="0" w:color="auto"/>
-            </w:tcBdr>
-          </w:tcPr>
-          <w:p>
-            <w:pPr>
-              <w:spacing w:before="40" w:after="40"/>
-            </w:pPr>
-            <w:r>
-              <w:rPr>
-                <w:rFonts w:ascii="Calibri" w:hAnsi="Calibri"/>
-                <w:b w:val="0"/>
-                <w:i w:val="0"/>
-                <w:color w:val="0078D4"/>
-                <w:sz w:val="19"/>
-              </w:rPr>
-              <w:t xml:space="preserve">✔  </w:t>
-            </w:r>
-            <w:r>
-              <w:rPr>
-                <w:rFonts w:ascii="Calibri" w:hAnsi="Calibri"/>
-                <w:b w:val="0"/>
-                <w:i w:val="0"/>
-                <w:color w:val="1A1A2E"/>
-                <w:sz w:val="19"/>
-              </w:rPr>
-              <w:t>Transformation digitale &amp; Innovation</w:t>
-            </w:r>
-          </w:p>
-        </w:tc>
-        <w:tc>
-          <w:tcPr>
-            <w:tcW w:type="dxa" w:w="4933"/>
-            <w:tcBdr>
-              <w:top w:val="none" w:sz="0" w:space="0" w:color="auto"/>
-              <w:left w:val="none" w:sz="0" w:space="0" w:color="auto"/>
-              <w:bottom w:val="none" w:sz="0" w:space="0" w:color="auto"/>
-              <w:right w:val="none" w:sz="0" w:space="0" w:color="auto"/>
-              <w:insideH w:val="none" w:sz="0" w:space="0" w:color="auto"/>
-              <w:insideV w:val="none" w:sz="0" w:space="0" w:color="auto"/>
-            </w:tcBdr>
-          </w:tcPr>
-          <w:p>
-            <w:pPr>
-              <w:spacing w:before="40" w:after="40"/>
-            </w:pPr>
-            <w:r>
-              <w:rPr>
-                <w:rFonts w:ascii="Calibri" w:hAnsi="Calibri"/>
-                <w:b w:val="0"/>
-                <w:i w:val="0"/>
-                <w:color w:val="0078D4"/>
-                <w:sz w:val="19"/>
-              </w:rPr>
-              <w:t xml:space="preserve">✔  </w:t>
-            </w:r>
-            <w:r>
-              <w:rPr>
-                <w:rFonts w:ascii="Calibri" w:hAnsi="Calibri"/>
-                <w:b w:val="0"/>
-                <w:i w:val="0"/>
-                <w:color w:val="1A1A2E"/>
-                <w:sz w:val="19"/>
-              </w:rPr>
-              <w:t>Maintenance informatique &amp; Helpdesk N2/N3</w:t>
-            </w:r>
-          </w:p>
-        </w:tc>
-      </w:tr>
-    </w:tbl>
-    <w:p/>
-    <w:p>
-      <w:pPr>
-        <w:spacing w:before="200" w:after="40"/>
-        <w:jc w:val="left"/>
-      </w:pPr>
-      <w:r>
-        <w:rPr>
-          <w:rFonts w:ascii="Calibri" w:hAnsi="Calibri"/>
-          <w:b/>
-          <w:i w:val="0"/>
-          <w:caps/>
-          <w:color w:val="163753"/>
-          <w:sz w:val="22"/>
-        </w:rPr>
-        <w:t>PROJETS NOTABLES</w:t>
-      </w:r>
-    </w:p>
-    <w:p>
-      <w:pPr>
-        <w:spacing w:before="40" w:after="40"/>
-        <w:pBdr>
-          <w:bottom w:val="single" w:sz="6" w:space="1" w:color="163753"/>
-        </w:pBdr>
-      </w:pPr>
-    </w:p>
-    <w:p>
-      <w:pPr>
-        <w:spacing w:before="60" w:after="0"/>
-        <w:ind w:left="170"/>
-        <w:jc w:val="left"/>
-      </w:pPr>
-      <w:r>
-        <w:rPr>
-          <w:rFonts w:ascii="Calibri" w:hAnsi="Calibri"/>
-          <w:b/>
-          <w:i w:val="0"/>
-          <w:color w:val="163753"/>
-          <w:sz w:val="20"/>
-        </w:rPr>
-        <w:t>▸ AdminSystem 360°</w:t>
-      </w:r>
-      <w:r>
-        <w:rPr>
-          <w:rFonts w:ascii="Calibri" w:hAnsi="Calibri"/>
-          <w:b w:val="0"/>
-          <w:i w:val="0"/>
-          <w:color w:val="555555"/>
-          <w:sz w:val="19"/>
-        </w:rPr>
-        <w:t xml:space="preserve">  —  ERP de gestion d'entreprise (modules RH, Stock, Paie)</w:t>
-      </w:r>
-    </w:p>
-    <w:p>
-      <w:pPr>
-        <w:spacing w:before="0" w:after="40"/>
-        <w:ind w:left="397"/>
-        <w:jc w:val="left"/>
-      </w:pPr>
-      <w:r>
-        <w:rPr>
-          <w:rFonts w:ascii="Calibri" w:hAnsi="Calibri"/>
-          <w:b w:val="0"/>
-          <w:i/>
-          <w:color w:val="AAAAAA"/>
-          <w:sz w:val="18"/>
-        </w:rPr>
-        <w:t>Stack : React · Node.js · MySQL</w:t>
-      </w:r>
-    </w:p>
-    <w:p>
-      <w:pPr>
-        <w:spacing w:before="60" w:after="0"/>
-        <w:ind w:left="170"/>
-        <w:jc w:val="left"/>
-      </w:pPr>
-      <w:r>
-        <w:rPr>
-          <w:rFonts w:ascii="Calibri" w:hAnsi="Calibri"/>
-          <w:b/>
-          <w:i w:val="0"/>
-          <w:color w:val="163753"/>
-          <w:sz w:val="20"/>
-        </w:rPr>
-        <w:t>▸ Système de Monitoring</w:t>
-      </w:r>
-      <w:r>
-        <w:rPr>
-          <w:rFonts w:ascii="Calibri" w:hAnsi="Calibri"/>
-          <w:b w:val="0"/>
-          <w:i w:val="0"/>
-          <w:color w:val="555555"/>
-          <w:sz w:val="19"/>
-        </w:rPr>
-        <w:t xml:space="preserve">  —  Supervision IoT de panneaux solaires en temps réel</w:t>
-      </w:r>
-    </w:p>
-    <w:p>
-      <w:pPr>
-        <w:spacing w:before="0" w:after="40"/>
-        <w:ind w:left="397"/>
-        <w:jc w:val="left"/>
-      </w:pPr>
-      <w:r>
-        <w:rPr>
-          <w:rFonts w:ascii="Calibri" w:hAnsi="Calibri"/>
-          <w:b w:val="0"/>
-          <w:i/>
-          <w:color w:val="AAAAAA"/>
-          <w:sz w:val="18"/>
-        </w:rPr>
-        <w:t>Stack : Python · Arduino · MQTT · Firebase</w:t>
-      </w:r>
-    </w:p>
-    <w:p>
-      <w:pPr>
-        <w:spacing w:before="60" w:after="0"/>
-        <w:ind w:left="170"/>
-        <w:jc w:val="left"/>
-      </w:pPr>
-      <w:r>
-        <w:rPr>
-          <w:rFonts w:ascii="Calibri" w:hAnsi="Calibri"/>
-          <w:b/>
-          <w:i w:val="0"/>
-          <w:color w:val="163753"/>
-          <w:sz w:val="20"/>
-        </w:rPr>
-        <w:t>▸ Ivoire Booking</w:t>
-      </w:r>
-      <w:r>
-        <w:rPr>
-          <w:rFonts w:ascii="Calibri" w:hAnsi="Calibri"/>
-          <w:b w:val="0"/>
-          <w:i w:val="0"/>
-          <w:color w:val="555555"/>
-          <w:sz w:val="19"/>
-        </w:rPr>
-        <w:t xml:space="preserve">  —  Plateforme de réservation d'événements en ligne</w:t>
-      </w:r>
-    </w:p>
-    <w:p>
-      <w:pPr>
-        <w:spacing w:before="0" w:after="40"/>
-        <w:ind w:left="397"/>
-        <w:jc w:val="left"/>
-      </w:pPr>
-      <w:r>
-        <w:rPr>
-          <w:rFonts w:ascii="Calibri" w:hAnsi="Calibri"/>
-          <w:b w:val="0"/>
-          <w:i/>
-          <w:color w:val="AAAAAA"/>
-          <w:sz w:val="18"/>
-        </w:rPr>
-        <w:t>Stack : React · Node.js · MongoDB · Cinetpay</w:t>
-      </w:r>
-    </w:p>
-    <w:p>
-      <w:pPr>
-        <w:spacing w:before="60" w:after="0"/>
-        <w:ind w:left="170"/>
-        <w:jc w:val="left"/>
-      </w:pPr>
-      <w:r>
-        <w:rPr>
-          <w:rFonts w:ascii="Calibri" w:hAnsi="Calibri"/>
-          <w:b/>
-          <w:i w:val="0"/>
-          <w:color w:val="163753"/>
-          <w:sz w:val="20"/>
-        </w:rPr>
-        <w:t>▸ MapParcelle</w:t>
-      </w:r>
-      <w:r>
-        <w:rPr>
-          <w:rFonts w:ascii="Calibri" w:hAnsi="Calibri"/>
-          <w:b w:val="0"/>
-          <w:i w:val="0"/>
-          <w:color w:val="555555"/>
-          <w:sz w:val="19"/>
-        </w:rPr>
-        <w:t xml:space="preserve">  —  Cartographie SIG des parcelles agricoles</w:t>
-      </w:r>
-    </w:p>
-    <w:p>
-      <w:pPr>
-        <w:spacing w:before="0" w:after="40"/>
-        <w:ind w:left="397"/>
-        <w:jc w:val="left"/>
-      </w:pPr>
-      <w:r>
-        <w:rPr>
-          <w:rFonts w:ascii="Calibri" w:hAnsi="Calibri"/>
-          <w:b w:val="0"/>
-          <w:i/>
-          <w:color w:val="AAAAAA"/>
-          <w:sz w:val="18"/>
-        </w:rPr>
-        <w:t>Stack : Leaflet.js · GCP · Python</w:t>
-      </w:r>
-    </w:p>
-    <w:p>
-      <w:pPr>
-        <w:spacing w:before="60" w:after="0"/>
-        <w:ind w:left="170"/>
-        <w:jc w:val="left"/>
-      </w:pPr>
-      <w:r>
-        <w:rPr>
-          <w:rFonts w:ascii="Calibri" w:hAnsi="Calibri"/>
-          <w:b/>
-          <w:i w:val="0"/>
-          <w:color w:val="163753"/>
-          <w:sz w:val="20"/>
-        </w:rPr>
-        <w:t>▸ AgriMarket</w:t>
-      </w:r>
-      <w:r>
-        <w:rPr>
-          <w:rFonts w:ascii="Calibri" w:hAnsi="Calibri"/>
-          <w:b w:val="0"/>
-          <w:i w:val="0"/>
-          <w:color w:val="555555"/>
-          <w:sz w:val="19"/>
-        </w:rPr>
-        <w:t xml:space="preserve">  —  Application mobile de commercialisation de produits agricoles</w:t>
-      </w:r>
-    </w:p>
-    <w:p>
-      <w:pPr>
-        <w:spacing w:before="0" w:after="40"/>
-        <w:ind w:left="397"/>
-        <w:jc w:val="left"/>
-      </w:pPr>
-      <w:r>
-        <w:rPr>
-          <w:rFonts w:ascii="Calibri" w:hAnsi="Calibri"/>
-          <w:b w:val="0"/>
-          <w:i/>
-          <w:color w:val="AAAAAA"/>
-          <w:sz w:val="18"/>
-        </w:rPr>
-        <w:t>Stack : Flutter · Firebase · Node.js</w:t>
-      </w:r>
-    </w:p>
-    <w:p>
-      <w:pPr>
-        <w:spacing w:before="60" w:after="0"/>
-        <w:ind w:left="170"/>
-        <w:jc w:val="left"/>
-      </w:pPr>
-      <w:r>
-        <w:rPr>
-          <w:rFonts w:ascii="Calibri" w:hAnsi="Calibri"/>
-          <w:b/>
-          <w:i w:val="0"/>
-          <w:color w:val="163753"/>
-          <w:sz w:val="20"/>
-        </w:rPr>
-        <w:t>▸ Deadline Manager</w:t>
-      </w:r>
-      <w:r>
-        <w:rPr>
-          <w:rFonts w:ascii="Calibri" w:hAnsi="Calibri"/>
-          <w:b w:val="0"/>
-          <w:i w:val="0"/>
-          <w:color w:val="555555"/>
-          <w:sz w:val="19"/>
-        </w:rPr>
-        <w:t xml:space="preserve">  —  Outil de gestion des deadlines et rappels automatisés</w:t>
-      </w:r>
-    </w:p>
-    <w:p>
-      <w:pPr>
-        <w:spacing w:before="0" w:after="40"/>
-        <w:ind w:left="397"/>
-        <w:jc w:val="left"/>
-      </w:pPr>
-      <w:r>
-        <w:rPr>
-          <w:rFonts w:ascii="Calibri" w:hAnsi="Calibri"/>
-          <w:b w:val="0"/>
-          <w:i/>
-          <w:color w:val="AAAAAA"/>
-          <w:sz w:val="18"/>
-        </w:rPr>
-        <w:t>Stack : React · Firebase · EmailJS</w:t>
-      </w:r>
-    </w:p>
-    <w:p>
-      <w:pPr>
-        <w:spacing w:before="200" w:after="40"/>
-        <w:jc w:val="left"/>
-      </w:pPr>
-      <w:r>
-        <w:rPr>
-          <w:rFonts w:ascii="Calibri" w:hAnsi="Calibri"/>
-          <w:b/>
-          <w:i w:val="0"/>
-          <w:caps/>
-          <w:color w:val="163753"/>
-          <w:sz w:val="22"/>
-        </w:rPr>
-        <w:t>LANGUES &amp; CENTRES D'INTÉRÊT</w:t>
-      </w:r>
-    </w:p>
-    <w:p>
-      <w:pPr>
-        <w:spacing w:before="40" w:after="40"/>
-        <w:pBdr>
-          <w:bottom w:val="single" w:sz="6" w:space="1" w:color="163753"/>
-        </w:pBdr>
-      </w:pPr>
-    </w:p>
-    <w:tbl>
-      <w:tblPr>
-        <w:tblStyle w:val="TableGrid"/>
-        <w:tblW w:type="auto" w:w="0"/>
-        <w:tblLook w:firstColumn="1" w:firstRow="1" w:lastColumn="0" w:lastRow="0" w:noHBand="0" w:noVBand="1" w:val="04A0"/>
-      </w:tblPr>
-      <w:tblGrid>
-        <w:gridCol w:w="4933"/>
-        <w:gridCol w:w="4933"/>
-      </w:tblGrid>
-      <w:tr>
-        <w:tc>
-          <w:tcPr>
-            <w:tcW w:type="dxa" w:w="4933"/>
-            <w:tcBdr>
-              <w:top w:val="none" w:sz="0" w:space="0" w:color="auto"/>
-              <w:left w:val="none" w:sz="0" w:space="0" w:color="auto"/>
-              <w:bottom w:val="none" w:sz="0" w:space="0" w:color="auto"/>
-              <w:right w:val="none" w:sz="0" w:space="0" w:color="auto"/>
-              <w:insideH w:val="none" w:sz="0" w:space="0" w:color="auto"/>
-              <w:insideV w:val="none" w:sz="0" w:space="0" w:color="auto"/>
-            </w:tcBdr>
-          </w:tcPr>
-          <w:p>
-            <w:pPr>
-              <w:spacing w:before="60" w:after="20"/>
+              <w:spacing w:before="100" w:after="0"/>
             </w:pPr>
             <w:r>
               <w:rPr>
                 <w:rFonts w:ascii="Calibri" w:hAnsi="Calibri"/>
                 <w:b/>
-                <w:i w:val="0"/>
-                <w:color w:val="163753"/>
+                <w:color w:val="0F2A3F"/>
+                <w:sz w:val="20"/>
+              </w:rPr>
+              <w:t>Master EEAI — Électronique, Automatique &amp; Informatique</w:t>
+            </w:r>
+            <w:r>
+              <w:rPr>
+                <w:rFonts w:ascii="Calibri" w:hAnsi="Calibri"/>
+                <w:i/>
+                <w:color w:val="1A8CD8"/>
                 <w:sz w:val="19"/>
               </w:rPr>
-              <w:t xml:space="preserve">Langues : </w:t>
+              <w:t xml:space="preserve">  —  Mention Bien</w:t>
             </w:r>
           </w:p>
           <w:p>
             <w:pPr>
-              <w:spacing w:before="0" w:after="20"/>
+              <w:spacing w:before="0" w:after="60"/>
+            </w:pPr>
+            <w:r>
+              <w:rPr>
+                <w:rFonts w:ascii="Calibri" w:hAnsi="Calibri"/>
+                <w:color w:val="444455"/>
+                <w:sz w:val="19"/>
+              </w:rPr>
+              <w:t>Université Félix Houphouët-Boigny (UFR-SSMT), Abidjan</w:t>
+            </w:r>
+            <w:r>
+              <w:rPr>
+                <w:rFonts w:ascii="Calibri" w:hAnsi="Calibri"/>
+                <w:i/>
+                <w:color w:val="9999AA"/>
+                <w:sz w:val="18"/>
+              </w:rPr>
+              <w:t xml:space="preserve">  ·  2024</w:t>
+            </w:r>
+          </w:p>
+          <w:p>
+            <w:pPr>
+              <w:spacing w:before="100" w:after="0"/>
+            </w:pPr>
+            <w:r>
+              <w:rPr>
+                <w:rFonts w:ascii="Calibri" w:hAnsi="Calibri"/>
+                <w:b/>
+                <w:color w:val="0F2A3F"/>
+                <w:sz w:val="20"/>
+              </w:rPr>
+              <w:t>Licence EEAI — Électronique, Automatique &amp; Informatique</w:t>
+            </w:r>
+          </w:p>
+          <w:p>
+            <w:pPr>
+              <w:spacing w:before="0" w:after="60"/>
+            </w:pPr>
+            <w:r>
+              <w:rPr>
+                <w:rFonts w:ascii="Calibri" w:hAnsi="Calibri"/>
+                <w:color w:val="444455"/>
+                <w:sz w:val="19"/>
+              </w:rPr>
+              <w:t>Université Félix Houphouët-Boigny (UFR-SSMT), Abidjan</w:t>
+            </w:r>
+            <w:r>
+              <w:rPr>
+                <w:rFonts w:ascii="Calibri" w:hAnsi="Calibri"/>
+                <w:i/>
+                <w:color w:val="9999AA"/>
+                <w:sz w:val="18"/>
+              </w:rPr>
+              <w:t xml:space="preserve">  ·  2022</w:t>
+            </w:r>
+          </w:p>
+          <w:p>
+            <w:pPr>
+              <w:spacing w:before="40" w:after="100"/>
               <w:ind w:left="227"/>
             </w:pPr>
             <w:r>
               <w:rPr>
                 <w:rFonts w:ascii="Calibri" w:hAnsi="Calibri"/>
                 <w:b/>
-                <w:i w:val="0"/>
-                <w:color w:val="1A1A2E"/>
+                <w:color w:val="0F2A3F"/>
                 <w:sz w:val="19"/>
               </w:rPr>
-              <w:t xml:space="preserve">• Français : </w:t>
+              <w:t xml:space="preserve">📄  Mémoire : </w:t>
             </w:r>
             <w:r>
               <w:rPr>
                 <w:rFonts w:ascii="Calibri" w:hAnsi="Calibri"/>
-                <w:b w:val="0"/>
-                <w:i w:val="0"/>
-                <w:color w:val="555555"/>
+                <w:i/>
+                <w:color w:val="444455"/>
                 <w:sz w:val="19"/>
               </w:rPr>
-              <w:t>Langue maternelle</w:t>
+              <w:t>"Conception et développement d'un système de monitoring et de télégestion d'infrastructures photovoltaïques"  —  Jury félicitations</w:t>
             </w:r>
           </w:p>
           <w:p>
             <w:pPr>
-              <w:spacing w:before="0" w:after="20"/>
-              <w:ind w:left="227"/>
+              <w:spacing w:before="240" w:after="60"/>
+              <w:pBdr>
+                <w:bottom w:val="single" w:sz="6" w:space="2" w:color="0F2A3F"/>
+              </w:pBdr>
             </w:pPr>
+            <w:r>
+              <w:rPr>
+                <w:sz w:val="22"/>
+              </w:rPr>
+              <w:t xml:space="preserve">🚀  </w:t>
+            </w:r>
             <w:r>
               <w:rPr>
                 <w:rFonts w:ascii="Calibri" w:hAnsi="Calibri"/>
                 <w:b/>
-                <w:i w:val="0"/>
-                <w:color w:val="1A1A2E"/>
-                <w:sz w:val="19"/>
+                <w:caps/>
+                <w:color w:val="0F2A3F"/>
+                <w:sz w:val="21"/>
               </w:rPr>
-              <w:t xml:space="preserve">• Anglais : </w:t>
-            </w:r>
-            <w:r>
-              <w:rPr>
-                <w:rFonts w:ascii="Calibri" w:hAnsi="Calibri"/>
-                <w:b w:val="0"/>
-                <w:i w:val="0"/>
-                <w:color w:val="555555"/>
-                <w:sz w:val="19"/>
-              </w:rPr>
-              <w:t>Professionnel (B2)</w:t>
+              <w:t>PROJETS NOTABLES</w:t>
             </w:r>
           </w:p>
-          <w:p>
-            <w:pPr>
-              <w:spacing w:before="0" w:after="20"/>
-              <w:ind w:left="227"/>
-            </w:pPr>
-            <w:r>
-              <w:rPr>
-                <w:rFonts w:ascii="Calibri" w:hAnsi="Calibri"/>
-                <w:b/>
-                <w:i w:val="0"/>
-                <w:color w:val="1A1A2E"/>
-                <w:sz w:val="19"/>
-              </w:rPr>
-              <w:t xml:space="preserve">• Dioula : </w:t>
-            </w:r>
-            <w:r>
-              <w:rPr>
-                <w:rFonts w:ascii="Calibri" w:hAnsi="Calibri"/>
-                <w:b w:val="0"/>
-                <w:i w:val="0"/>
-                <w:color w:val="555555"/>
-                <w:sz w:val="19"/>
-              </w:rPr>
-              <w:t>Courant</w:t>
-            </w:r>
-          </w:p>
-        </w:tc>
-        <w:tc>
-          <w:tcPr>
-            <w:tcW w:type="dxa" w:w="4933"/>
-            <w:tcBdr>
-              <w:top w:val="none" w:sz="0" w:space="0" w:color="auto"/>
-              <w:left w:val="none" w:sz="0" w:space="0" w:color="auto"/>
-              <w:bottom w:val="none" w:sz="0" w:space="0" w:color="auto"/>
-              <w:right w:val="none" w:sz="0" w:space="0" w:color="auto"/>
-              <w:insideH w:val="none" w:sz="0" w:space="0" w:color="auto"/>
-              <w:insideV w:val="none" w:sz="0" w:space="0" w:color="auto"/>
-            </w:tcBdr>
-          </w:tcPr>
-          <w:p>
-            <w:pPr>
-              <w:spacing w:before="60" w:after="20"/>
-            </w:pPr>
-            <w:r>
-              <w:rPr>
-                <w:rFonts w:ascii="Calibri" w:hAnsi="Calibri"/>
-                <w:b/>
-                <w:i w:val="0"/>
-                <w:color w:val="163753"/>
-                <w:sz w:val="19"/>
-              </w:rPr>
-              <w:t xml:space="preserve">Centres d'intérêt : </w:t>
-            </w:r>
-          </w:p>
-          <w:p>
-            <w:pPr>
-              <w:spacing w:before="0" w:after="20"/>
-              <w:ind w:left="227"/>
-            </w:pPr>
-            <w:r>
-              <w:rPr>
-                <w:rFonts w:ascii="Calibri" w:hAnsi="Calibri"/>
-                <w:b w:val="0"/>
-                <w:i w:val="0"/>
-                <w:color w:val="555555"/>
-                <w:sz w:val="19"/>
-              </w:rPr>
-              <w:t>• Intelligence artificielle &amp; ML</w:t>
-            </w:r>
-          </w:p>
-          <w:p>
-            <w:pPr>
-              <w:spacing w:before="0" w:after="20"/>
-              <w:ind w:left="227"/>
-            </w:pPr>
-            <w:r>
-              <w:rPr>
-                <w:rFonts w:ascii="Calibri" w:hAnsi="Calibri"/>
-                <w:b w:val="0"/>
-                <w:i w:val="0"/>
-                <w:color w:val="555555"/>
-                <w:sz w:val="19"/>
-              </w:rPr>
-              <w:t>• Robotique &amp; IoT</w:t>
-            </w:r>
-          </w:p>
-          <w:p>
-            <w:pPr>
-              <w:spacing w:before="0" w:after="20"/>
-              <w:ind w:left="227"/>
-            </w:pPr>
-            <w:r>
-              <w:rPr>
-                <w:rFonts w:ascii="Calibri" w:hAnsi="Calibri"/>
-                <w:b w:val="0"/>
-                <w:i w:val="0"/>
-                <w:color w:val="555555"/>
-                <w:sz w:val="19"/>
-              </w:rPr>
-              <w:t>• Entrepreneuriat tech</w:t>
-            </w:r>
-          </w:p>
-          <w:p>
-            <w:pPr>
-              <w:spacing w:before="0" w:after="20"/>
-              <w:ind w:left="227"/>
-            </w:pPr>
-            <w:r>
-              <w:rPr>
-                <w:rFonts w:ascii="Calibri" w:hAnsi="Calibri"/>
-                <w:b w:val="0"/>
-                <w:i w:val="0"/>
-                <w:color w:val="555555"/>
-                <w:sz w:val="19"/>
-              </w:rPr>
-              <w:t>• Open source &amp; veille technologique</w:t>
-            </w:r>
-          </w:p>
+          <w:tbl>
+            <w:tblPr>
+              <w:tblW w:type="auto" w:w="0"/>
+              <w:tblLook w:firstColumn="1" w:firstRow="1" w:lastColumn="0" w:lastRow="0" w:noHBand="0" w:noVBand="1" w:val="04A0"/>
+            </w:tblPr>
+            <w:tblGrid>
+              <w:gridCol w:w="4025"/>
+              <w:gridCol w:w="4025"/>
+            </w:tblGrid>
+            <w:tr>
+              <w:tc>
+                <w:tcPr>
+                  <w:tcW w:type="dxa" w:w="4025"/>
+                  <w:tcBdr>
+                    <w:top w:val="none" w:sz="0" w:space="0" w:color="auto"/>
+                    <w:left w:val="none" w:sz="0" w:space="0" w:color="auto"/>
+                    <w:bottom w:val="none" w:sz="0" w:space="0" w:color="auto"/>
+                    <w:right w:val="none" w:sz="0" w:space="0" w:color="auto"/>
+                    <w:insideH w:val="none" w:sz="0" w:space="0" w:color="auto"/>
+                    <w:insideV w:val="none" w:sz="0" w:space="0" w:color="auto"/>
+                  </w:tcBdr>
+                  <w:tcMar>
+                    <w:top w:w="40" w:type="dxa"/>
+                    <w:start w:w="0" w:type="dxa"/>
+                    <w:bottom w:w="40" w:type="dxa"/>
+                    <w:end w:w="60" w:type="dxa"/>
+                  </w:tcMar>
+                </w:tcPr>
+                <w:p>
+                  <w:pPr>
+                    <w:spacing w:before="40" w:after="0"/>
+                  </w:pPr>
+                  <w:r>
+                    <w:rPr>
+                      <w:rFonts w:ascii="Calibri" w:hAnsi="Calibri"/>
+                      <w:b/>
+                      <w:color w:val="0F2A3F"/>
+                      <w:sz w:val="19"/>
+                    </w:rPr>
+                    <w:t>▸ AdminSystem 360°</w:t>
+                  </w:r>
+                </w:p>
+                <w:p>
+                  <w:pPr>
+                    <w:spacing w:before="0" w:after="0"/>
+                  </w:pPr>
+                  <w:r>
+                    <w:rPr>
+                      <w:rFonts w:ascii="Calibri" w:hAnsi="Calibri"/>
+                      <w:color w:val="444455"/>
+                      <w:sz w:val="18"/>
+                    </w:rPr>
+                    <w:t>ERP modulaire (RH, Stock, Paie)</w:t>
+                  </w:r>
+                </w:p>
+                <w:p>
+                  <w:pPr>
+                    <w:spacing w:before="0" w:after="60"/>
+                  </w:pPr>
+                  <w:r>
+                    <w:rPr>
+                      <w:rFonts w:ascii="Calibri" w:hAnsi="Calibri"/>
+                      <w:i/>
+                      <w:color w:val="1A8CD8"/>
+                      <w:sz w:val="17"/>
+                    </w:rPr>
+                    <w:t>React · Node.js · MySQL</w:t>
+                  </w:r>
+                </w:p>
+              </w:tc>
+              <w:tc>
+                <w:tcPr>
+                  <w:tcW w:type="dxa" w:w="4025"/>
+                  <w:tcBdr>
+                    <w:top w:val="none" w:sz="0" w:space="0" w:color="auto"/>
+                    <w:left w:val="none" w:sz="0" w:space="0" w:color="auto"/>
+                    <w:bottom w:val="none" w:sz="0" w:space="0" w:color="auto"/>
+                    <w:right w:val="none" w:sz="0" w:space="0" w:color="auto"/>
+                    <w:insideH w:val="none" w:sz="0" w:space="0" w:color="auto"/>
+                    <w:insideV w:val="none" w:sz="0" w:space="0" w:color="auto"/>
+                  </w:tcBdr>
+                  <w:tcMar>
+                    <w:top w:w="40" w:type="dxa"/>
+                    <w:start w:w="0" w:type="dxa"/>
+                    <w:bottom w:w="40" w:type="dxa"/>
+                    <w:end w:w="60" w:type="dxa"/>
+                  </w:tcMar>
+                </w:tcPr>
+                <w:p>
+                  <w:pPr>
+                    <w:spacing w:before="40" w:after="0"/>
+                  </w:pPr>
+                  <w:r>
+                    <w:rPr>
+                      <w:rFonts w:ascii="Calibri" w:hAnsi="Calibri"/>
+                      <w:b/>
+                      <w:color w:val="0F2A3F"/>
+                      <w:sz w:val="19"/>
+                    </w:rPr>
+                    <w:t>▸ Système de Monitoring</w:t>
+                  </w:r>
+                </w:p>
+                <w:p>
+                  <w:pPr>
+                    <w:spacing w:before="0" w:after="0"/>
+                  </w:pPr>
+                  <w:r>
+                    <w:rPr>
+                      <w:rFonts w:ascii="Calibri" w:hAnsi="Calibri"/>
+                      <w:color w:val="444455"/>
+                      <w:sz w:val="18"/>
+                    </w:rPr>
+                    <w:t>Supervision IoT panneaux solaires temps réel</w:t>
+                  </w:r>
+                </w:p>
+                <w:p>
+                  <w:pPr>
+                    <w:spacing w:before="0" w:after="60"/>
+                  </w:pPr>
+                  <w:r>
+                    <w:rPr>
+                      <w:rFonts w:ascii="Calibri" w:hAnsi="Calibri"/>
+                      <w:i/>
+                      <w:color w:val="1A8CD8"/>
+                      <w:sz w:val="17"/>
+                    </w:rPr>
+                    <w:t>Python · Arduino · MQTT · Firebase</w:t>
+                  </w:r>
+                </w:p>
+              </w:tc>
+            </w:tr>
+            <w:tr>
+              <w:tc>
+                <w:tcPr>
+                  <w:tcW w:type="dxa" w:w="4025"/>
+                  <w:tcBdr>
+                    <w:top w:val="none" w:sz="0" w:space="0" w:color="auto"/>
+                    <w:left w:val="none" w:sz="0" w:space="0" w:color="auto"/>
+                    <w:bottom w:val="none" w:sz="0" w:space="0" w:color="auto"/>
+                    <w:right w:val="none" w:sz="0" w:space="0" w:color="auto"/>
+                    <w:insideH w:val="none" w:sz="0" w:space="0" w:color="auto"/>
+                    <w:insideV w:val="none" w:sz="0" w:space="0" w:color="auto"/>
+                  </w:tcBdr>
+                  <w:tcMar>
+                    <w:top w:w="40" w:type="dxa"/>
+                    <w:start w:w="0" w:type="dxa"/>
+                    <w:bottom w:w="40" w:type="dxa"/>
+                    <w:end w:w="60" w:type="dxa"/>
+                  </w:tcMar>
+                </w:tcPr>
+                <w:p>
+                  <w:pPr>
+                    <w:spacing w:before="40" w:after="0"/>
+                  </w:pPr>
+                  <w:r>
+                    <w:rPr>
+                      <w:rFonts w:ascii="Calibri" w:hAnsi="Calibri"/>
+                      <w:b/>
+                      <w:color w:val="0F2A3F"/>
+                      <w:sz w:val="19"/>
+                    </w:rPr>
+                    <w:t>▸ Ivoire Booking</w:t>
+                  </w:r>
+                </w:p>
+                <w:p>
+                  <w:pPr>
+                    <w:spacing w:before="0" w:after="0"/>
+                  </w:pPr>
+                  <w:r>
+                    <w:rPr>
+                      <w:rFonts w:ascii="Calibri" w:hAnsi="Calibri"/>
+                      <w:color w:val="444455"/>
+                      <w:sz w:val="18"/>
+                    </w:rPr>
+                    <w:t>Plateforme réservation événementielle</w:t>
+                  </w:r>
+                </w:p>
+                <w:p>
+                  <w:pPr>
+                    <w:spacing w:before="0" w:after="60"/>
+                  </w:pPr>
+                  <w:r>
+                    <w:rPr>
+                      <w:rFonts w:ascii="Calibri" w:hAnsi="Calibri"/>
+                      <w:i/>
+                      <w:color w:val="1A8CD8"/>
+                      <w:sz w:val="17"/>
+                    </w:rPr>
+                    <w:t>React · Node.js · MongoDB · Cinetpay</w:t>
+                  </w:r>
+                </w:p>
+              </w:tc>
+              <w:tc>
+                <w:tcPr>
+                  <w:tcW w:type="dxa" w:w="4025"/>
+                  <w:tcBdr>
+                    <w:top w:val="none" w:sz="0" w:space="0" w:color="auto"/>
+                    <w:left w:val="none" w:sz="0" w:space="0" w:color="auto"/>
+                    <w:bottom w:val="none" w:sz="0" w:space="0" w:color="auto"/>
+                    <w:right w:val="none" w:sz="0" w:space="0" w:color="auto"/>
+                    <w:insideH w:val="none" w:sz="0" w:space="0" w:color="auto"/>
+                    <w:insideV w:val="none" w:sz="0" w:space="0" w:color="auto"/>
+                  </w:tcBdr>
+                  <w:tcMar>
+                    <w:top w:w="40" w:type="dxa"/>
+                    <w:start w:w="0" w:type="dxa"/>
+                    <w:bottom w:w="40" w:type="dxa"/>
+                    <w:end w:w="60" w:type="dxa"/>
+                  </w:tcMar>
+                </w:tcPr>
+                <w:p>
+                  <w:pPr>
+                    <w:spacing w:before="40" w:after="0"/>
+                  </w:pPr>
+                  <w:r>
+                    <w:rPr>
+                      <w:rFonts w:ascii="Calibri" w:hAnsi="Calibri"/>
+                      <w:b/>
+                      <w:color w:val="0F2A3F"/>
+                      <w:sz w:val="19"/>
+                    </w:rPr>
+                    <w:t>▸ MapParcelle</w:t>
+                  </w:r>
+                </w:p>
+                <w:p>
+                  <w:pPr>
+                    <w:spacing w:before="0" w:after="0"/>
+                  </w:pPr>
+                  <w:r>
+                    <w:rPr>
+                      <w:rFonts w:ascii="Calibri" w:hAnsi="Calibri"/>
+                      <w:color w:val="444455"/>
+                      <w:sz w:val="18"/>
+                    </w:rPr>
+                    <w:t>Cartographie SIG des parcelles agricoles</w:t>
+                  </w:r>
+                </w:p>
+                <w:p>
+                  <w:pPr>
+                    <w:spacing w:before="0" w:after="60"/>
+                  </w:pPr>
+                  <w:r>
+                    <w:rPr>
+                      <w:rFonts w:ascii="Calibri" w:hAnsi="Calibri"/>
+                      <w:i/>
+                      <w:color w:val="1A8CD8"/>
+                      <w:sz w:val="17"/>
+                    </w:rPr>
+                    <w:t>Leaflet.js · GCP · Python</w:t>
+                  </w:r>
+                </w:p>
+              </w:tc>
+            </w:tr>
+            <w:tr>
+              <w:tc>
+                <w:tcPr>
+                  <w:tcW w:type="dxa" w:w="4025"/>
+                  <w:tcBdr>
+                    <w:top w:val="none" w:sz="0" w:space="0" w:color="auto"/>
+                    <w:left w:val="none" w:sz="0" w:space="0" w:color="auto"/>
+                    <w:bottom w:val="none" w:sz="0" w:space="0" w:color="auto"/>
+                    <w:right w:val="none" w:sz="0" w:space="0" w:color="auto"/>
+                    <w:insideH w:val="none" w:sz="0" w:space="0" w:color="auto"/>
+                    <w:insideV w:val="none" w:sz="0" w:space="0" w:color="auto"/>
+                  </w:tcBdr>
+                  <w:tcMar>
+                    <w:top w:w="40" w:type="dxa"/>
+                    <w:start w:w="0" w:type="dxa"/>
+                    <w:bottom w:w="40" w:type="dxa"/>
+                    <w:end w:w="60" w:type="dxa"/>
+                  </w:tcMar>
+                </w:tcPr>
+                <w:p>
+                  <w:pPr>
+                    <w:spacing w:before="40" w:after="0"/>
+                  </w:pPr>
+                  <w:r>
+                    <w:rPr>
+                      <w:rFonts w:ascii="Calibri" w:hAnsi="Calibri"/>
+                      <w:b/>
+                      <w:color w:val="0F2A3F"/>
+                      <w:sz w:val="19"/>
+                    </w:rPr>
+                    <w:t>▸ AgriMarket</w:t>
+                  </w:r>
+                </w:p>
+                <w:p>
+                  <w:pPr>
+                    <w:spacing w:before="0" w:after="0"/>
+                  </w:pPr>
+                  <w:r>
+                    <w:rPr>
+                      <w:rFonts w:ascii="Calibri" w:hAnsi="Calibri"/>
+                      <w:color w:val="444455"/>
+                      <w:sz w:val="18"/>
+                    </w:rPr>
+                    <w:t>App mobile de commercialisation agricole</w:t>
+                  </w:r>
+                </w:p>
+                <w:p>
+                  <w:pPr>
+                    <w:spacing w:before="0" w:after="60"/>
+                  </w:pPr>
+                  <w:r>
+                    <w:rPr>
+                      <w:rFonts w:ascii="Calibri" w:hAnsi="Calibri"/>
+                      <w:i/>
+                      <w:color w:val="1A8CD8"/>
+                      <w:sz w:val="17"/>
+                    </w:rPr>
+                    <w:t>Flutter · Firebase · Node.js</w:t>
+                  </w:r>
+                </w:p>
+              </w:tc>
+              <w:tc>
+                <w:tcPr>
+                  <w:tcW w:type="dxa" w:w="4025"/>
+                  <w:tcBdr>
+                    <w:top w:val="none" w:sz="0" w:space="0" w:color="auto"/>
+                    <w:left w:val="none" w:sz="0" w:space="0" w:color="auto"/>
+                    <w:bottom w:val="none" w:sz="0" w:space="0" w:color="auto"/>
+                    <w:right w:val="none" w:sz="0" w:space="0" w:color="auto"/>
+                    <w:insideH w:val="none" w:sz="0" w:space="0" w:color="auto"/>
+                    <w:insideV w:val="none" w:sz="0" w:space="0" w:color="auto"/>
+                  </w:tcBdr>
+                  <w:tcMar>
+                    <w:top w:w="40" w:type="dxa"/>
+                    <w:start w:w="0" w:type="dxa"/>
+                    <w:bottom w:w="40" w:type="dxa"/>
+                    <w:end w:w="60" w:type="dxa"/>
+                  </w:tcMar>
+                </w:tcPr>
+                <w:p>
+                  <w:pPr>
+                    <w:spacing w:before="40" w:after="0"/>
+                  </w:pPr>
+                  <w:r>
+                    <w:rPr>
+                      <w:rFonts w:ascii="Calibri" w:hAnsi="Calibri"/>
+                      <w:b/>
+                      <w:color w:val="0F2A3F"/>
+                      <w:sz w:val="19"/>
+                    </w:rPr>
+                    <w:t>▸ Deadline Manager</w:t>
+                  </w:r>
+                </w:p>
+                <w:p>
+                  <w:pPr>
+                    <w:spacing w:before="0" w:after="0"/>
+                  </w:pPr>
+                  <w:r>
+                    <w:rPr>
+                      <w:rFonts w:ascii="Calibri" w:hAnsi="Calibri"/>
+                      <w:color w:val="444455"/>
+                      <w:sz w:val="18"/>
+                    </w:rPr>
+                    <w:t>Outil de gestion des deadlines &amp; rappels auto</w:t>
+                  </w:r>
+                </w:p>
+                <w:p>
+                  <w:pPr>
+                    <w:spacing w:before="0" w:after="60"/>
+                  </w:pPr>
+                  <w:r>
+                    <w:rPr>
+                      <w:rFonts w:ascii="Calibri" w:hAnsi="Calibri"/>
+                      <w:i/>
+                      <w:color w:val="1A8CD8"/>
+                      <w:sz w:val="17"/>
+                    </w:rPr>
+                    <w:t>React · Firebase · EmailJS</w:t>
+                  </w:r>
+                </w:p>
+              </w:tc>
+            </w:tr>
+          </w:tbl>
+          <w:p/>
         </w:tc>
       </w:tr>
     </w:tbl>
     <w:sectPr>
       <w:pgSz w:w="11906" w:h="16838"/>
-      <w:pgMar w:top="850" w:right="1020" w:bottom="850" w:left="1020" w:header="720" w:footer="720" w:gutter="0"/>
+      <w:pgMar w:top="0" w:right="0" w:bottom="680" w:left="0" w:header="720" w:footer="720" w:gutter="0"/>
       <w:cols w:space="720"/>
       <w:docGrid w:linePitch="360"/>
     </w:sectPr>
@@ -2897,7 +2372,7 @@
     <w:rsid w:val="00FC693F"/>
     <w:rPr>
       <w:rFonts w:ascii="Calibri" w:hAnsi="Calibri"/>
-      <w:sz w:val="20"/>
+      <w:sz w:val="19"/>
     </w:rPr>
   </w:style>
   <w:style w:type="paragraph" w:styleId="Header">

</xml_diff>